<commit_message>
Doc: Fix final doc and slide version.
</commit_message>
<xml_diff>
--- a/docs/Nhom12_BaoCaoCuoiKy.docx
+++ b/docs/Nhom12_BaoCaoCuoiKy.docx
@@ -907,7 +907,11 @@
             <w:t>MỤC LỤC</w:t>
           </w:r>
         </w:p>
-        <w:p/>
+        <w:p>
+          <w:pPr>
+            <w:spacing w:line="312" w:lineRule="auto"/>
+          </w:pPr>
+        </w:p>
         <w:p>
           <w:pPr>
             <w:pStyle w:val="TOC1"/>
@@ -943,7 +947,7 @@
             </w:rPr>
             <w:fldChar w:fldCharType="separate"/>
           </w:r>
-          <w:hyperlink w:anchor="_Toc228217436" w:history="1">
+          <w:hyperlink w:anchor="_Toc228229103" w:history="1">
             <w:r>
               <w:rPr>
                 <w:rStyle w:val="Hyperlink"/>
@@ -990,7 +994,7 @@
                 <w:noProof/>
                 <w:webHidden/>
               </w:rPr>
-              <w:instrText xml:space="preserve"> PAGEREF _Toc228217436 \h </w:instrText>
+              <w:instrText xml:space="preserve"> PAGEREF _Toc228229103 \h </w:instrText>
             </w:r>
             <w:r>
               <w:rPr>
@@ -1035,7 +1039,7 @@
               <w14:ligatures w14:val="standardContextual"/>
             </w:rPr>
           </w:pPr>
-          <w:hyperlink w:anchor="_Toc228217437" w:history="1">
+          <w:hyperlink w:anchor="_Toc228229104" w:history="1">
             <w:r>
               <w:rPr>
                 <w:rStyle w:val="Hyperlink"/>
@@ -1082,7 +1086,7 @@
                 <w:noProof/>
                 <w:webHidden/>
               </w:rPr>
-              <w:instrText xml:space="preserve"> PAGEREF _Toc228217437 \h </w:instrText>
+              <w:instrText xml:space="preserve"> PAGEREF _Toc228229104 \h </w:instrText>
             </w:r>
             <w:r>
               <w:rPr>
@@ -1127,7 +1131,7 @@
               <w14:ligatures w14:val="standardContextual"/>
             </w:rPr>
           </w:pPr>
-          <w:hyperlink w:anchor="_Toc228217438" w:history="1">
+          <w:hyperlink w:anchor="_Toc228229105" w:history="1">
             <w:r>
               <w:rPr>
                 <w:rStyle w:val="Hyperlink"/>
@@ -1170,7 +1174,7 @@
                 <w:noProof/>
                 <w:webHidden/>
               </w:rPr>
-              <w:instrText xml:space="preserve"> PAGEREF _Toc228217438 \h </w:instrText>
+              <w:instrText xml:space="preserve"> PAGEREF _Toc228229105 \h </w:instrText>
             </w:r>
             <w:r>
               <w:rPr>
@@ -1215,7 +1219,7 @@
               <w14:ligatures w14:val="standardContextual"/>
             </w:rPr>
           </w:pPr>
-          <w:hyperlink w:anchor="_Toc228217439" w:history="1">
+          <w:hyperlink w:anchor="_Toc228229106" w:history="1">
             <w:r>
               <w:rPr>
                 <w:rStyle w:val="Hyperlink"/>
@@ -1258,7 +1262,7 @@
                 <w:noProof/>
                 <w:webHidden/>
               </w:rPr>
-              <w:instrText xml:space="preserve"> PAGEREF _Toc228217439 \h </w:instrText>
+              <w:instrText xml:space="preserve"> PAGEREF _Toc228229106 \h </w:instrText>
             </w:r>
             <w:r>
               <w:rPr>
@@ -1303,7 +1307,7 @@
               <w14:ligatures w14:val="standardContextual"/>
             </w:rPr>
           </w:pPr>
-          <w:hyperlink w:anchor="_Toc228217440" w:history="1">
+          <w:hyperlink w:anchor="_Toc228229107" w:history="1">
             <w:r>
               <w:rPr>
                 <w:rStyle w:val="Hyperlink"/>
@@ -1346,7 +1350,7 @@
                 <w:noProof/>
                 <w:webHidden/>
               </w:rPr>
-              <w:instrText xml:space="preserve"> PAGEREF _Toc228217440 \h </w:instrText>
+              <w:instrText xml:space="preserve"> PAGEREF _Toc228229107 \h </w:instrText>
             </w:r>
             <w:r>
               <w:rPr>
@@ -1391,7 +1395,7 @@
               <w14:ligatures w14:val="standardContextual"/>
             </w:rPr>
           </w:pPr>
-          <w:hyperlink w:anchor="_Toc228217441" w:history="1">
+          <w:hyperlink w:anchor="_Toc228229108" w:history="1">
             <w:r>
               <w:rPr>
                 <w:rStyle w:val="Hyperlink"/>
@@ -1434,7 +1438,7 @@
                 <w:noProof/>
                 <w:webHidden/>
               </w:rPr>
-              <w:instrText xml:space="preserve"> PAGEREF _Toc228217441 \h </w:instrText>
+              <w:instrText xml:space="preserve"> PAGEREF _Toc228229108 \h </w:instrText>
             </w:r>
             <w:r>
               <w:rPr>
@@ -1479,7 +1483,7 @@
               <w14:ligatures w14:val="standardContextual"/>
             </w:rPr>
           </w:pPr>
-          <w:hyperlink w:anchor="_Toc228217442" w:history="1">
+          <w:hyperlink w:anchor="_Toc228229109" w:history="1">
             <w:r>
               <w:rPr>
                 <w:rStyle w:val="Hyperlink"/>
@@ -1522,7 +1526,7 @@
                 <w:noProof/>
                 <w:webHidden/>
               </w:rPr>
-              <w:instrText xml:space="preserve"> PAGEREF _Toc228217442 \h </w:instrText>
+              <w:instrText xml:space="preserve"> PAGEREF _Toc228229109 \h </w:instrText>
             </w:r>
             <w:r>
               <w:rPr>
@@ -1567,7 +1571,7 @@
               <w14:ligatures w14:val="standardContextual"/>
             </w:rPr>
           </w:pPr>
-          <w:hyperlink w:anchor="_Toc228217443" w:history="1">
+          <w:hyperlink w:anchor="_Toc228229110" w:history="1">
             <w:r>
               <w:rPr>
                 <w:rStyle w:val="Hyperlink"/>
@@ -1614,7 +1618,7 @@
                 <w:noProof/>
                 <w:webHidden/>
               </w:rPr>
-              <w:instrText xml:space="preserve"> PAGEREF _Toc228217443 \h </w:instrText>
+              <w:instrText xml:space="preserve"> PAGEREF _Toc228229110 \h </w:instrText>
             </w:r>
             <w:r>
               <w:rPr>
@@ -1659,7 +1663,7 @@
               <w14:ligatures w14:val="standardContextual"/>
             </w:rPr>
           </w:pPr>
-          <w:hyperlink w:anchor="_Toc228217444" w:history="1">
+          <w:hyperlink w:anchor="_Toc228229111" w:history="1">
             <w:r>
               <w:rPr>
                 <w:rStyle w:val="Hyperlink"/>
@@ -1702,7 +1706,7 @@
                 <w:noProof/>
                 <w:webHidden/>
               </w:rPr>
-              <w:instrText xml:space="preserve"> PAGEREF _Toc228217444 \h </w:instrText>
+              <w:instrText xml:space="preserve"> PAGEREF _Toc228229111 \h </w:instrText>
             </w:r>
             <w:r>
               <w:rPr>
@@ -1747,7 +1751,7 @@
               <w14:ligatures w14:val="standardContextual"/>
             </w:rPr>
           </w:pPr>
-          <w:hyperlink w:anchor="_Toc228217445" w:history="1">
+          <w:hyperlink w:anchor="_Toc228229112" w:history="1">
             <w:r>
               <w:rPr>
                 <w:rStyle w:val="Hyperlink"/>
@@ -1790,7 +1794,7 @@
                 <w:noProof/>
                 <w:webHidden/>
               </w:rPr>
-              <w:instrText xml:space="preserve"> PAGEREF _Toc228217445 \h </w:instrText>
+              <w:instrText xml:space="preserve"> PAGEREF _Toc228229112 \h </w:instrText>
             </w:r>
             <w:r>
               <w:rPr>
@@ -1835,7 +1839,7 @@
               <w14:ligatures w14:val="standardContextual"/>
             </w:rPr>
           </w:pPr>
-          <w:hyperlink w:anchor="_Toc228217446" w:history="1">
+          <w:hyperlink w:anchor="_Toc228229113" w:history="1">
             <w:r>
               <w:rPr>
                 <w:rStyle w:val="Hyperlink"/>
@@ -1884,7 +1888,7 @@
                 <w:noProof/>
                 <w:webHidden/>
               </w:rPr>
-              <w:instrText xml:space="preserve"> PAGEREF _Toc228217446 \h </w:instrText>
+              <w:instrText xml:space="preserve"> PAGEREF _Toc228229113 \h </w:instrText>
             </w:r>
             <w:r>
               <w:rPr>
@@ -1929,7 +1933,7 @@
               <w14:ligatures w14:val="standardContextual"/>
             </w:rPr>
           </w:pPr>
-          <w:hyperlink w:anchor="_Toc228217447" w:history="1">
+          <w:hyperlink w:anchor="_Toc228229114" w:history="1">
             <w:r>
               <w:rPr>
                 <w:rStyle w:val="Hyperlink"/>
@@ -1972,7 +1976,7 @@
                 <w:noProof/>
                 <w:webHidden/>
               </w:rPr>
-              <w:instrText xml:space="preserve"> PAGEREF _Toc228217447 \h </w:instrText>
+              <w:instrText xml:space="preserve"> PAGEREF _Toc228229114 \h </w:instrText>
             </w:r>
             <w:r>
               <w:rPr>
@@ -2017,7 +2021,7 @@
               <w14:ligatures w14:val="standardContextual"/>
             </w:rPr>
           </w:pPr>
-          <w:hyperlink w:anchor="_Toc228217448" w:history="1">
+          <w:hyperlink w:anchor="_Toc228229115" w:history="1">
             <w:r>
               <w:rPr>
                 <w:rStyle w:val="Hyperlink"/>
@@ -2064,7 +2068,7 @@
                 <w:noProof/>
                 <w:webHidden/>
               </w:rPr>
-              <w:instrText xml:space="preserve"> PAGEREF _Toc228217448 \h </w:instrText>
+              <w:instrText xml:space="preserve"> PAGEREF _Toc228229115 \h </w:instrText>
             </w:r>
             <w:r>
               <w:rPr>
@@ -2109,7 +2113,7 @@
               <w14:ligatures w14:val="standardContextual"/>
             </w:rPr>
           </w:pPr>
-          <w:hyperlink w:anchor="_Toc228217449" w:history="1">
+          <w:hyperlink w:anchor="_Toc228229116" w:history="1">
             <w:r>
               <w:rPr>
                 <w:rStyle w:val="Hyperlink"/>
@@ -2156,7 +2160,7 @@
                 <w:noProof/>
                 <w:webHidden/>
               </w:rPr>
-              <w:instrText xml:space="preserve"> PAGEREF _Toc228217449 \h </w:instrText>
+              <w:instrText xml:space="preserve"> PAGEREF _Toc228229116 \h </w:instrText>
             </w:r>
             <w:r>
               <w:rPr>
@@ -2201,7 +2205,7 @@
               <w14:ligatures w14:val="standardContextual"/>
             </w:rPr>
           </w:pPr>
-          <w:hyperlink w:anchor="_Toc228217450" w:history="1">
+          <w:hyperlink w:anchor="_Toc228229117" w:history="1">
             <w:r>
               <w:rPr>
                 <w:rStyle w:val="Hyperlink"/>
@@ -2248,7 +2252,7 @@
                 <w:noProof/>
                 <w:webHidden/>
               </w:rPr>
-              <w:instrText xml:space="preserve"> PAGEREF _Toc228217450 \h </w:instrText>
+              <w:instrText xml:space="preserve"> PAGEREF _Toc228229117 \h </w:instrText>
             </w:r>
             <w:r>
               <w:rPr>
@@ -2293,7 +2297,7 @@
               <w14:ligatures w14:val="standardContextual"/>
             </w:rPr>
           </w:pPr>
-          <w:hyperlink w:anchor="_Toc228217451" w:history="1">
+          <w:hyperlink w:anchor="_Toc228229118" w:history="1">
             <w:r>
               <w:rPr>
                 <w:rStyle w:val="Hyperlink"/>
@@ -2336,7 +2340,7 @@
                 <w:noProof/>
                 <w:webHidden/>
               </w:rPr>
-              <w:instrText xml:space="preserve"> PAGEREF _Toc228217451 \h </w:instrText>
+              <w:instrText xml:space="preserve"> PAGEREF _Toc228229118 \h </w:instrText>
             </w:r>
             <w:r>
               <w:rPr>
@@ -2381,7 +2385,7 @@
               <w14:ligatures w14:val="standardContextual"/>
             </w:rPr>
           </w:pPr>
-          <w:hyperlink w:anchor="_Toc228217452" w:history="1">
+          <w:hyperlink w:anchor="_Toc228229119" w:history="1">
             <w:r>
               <w:rPr>
                 <w:rStyle w:val="Hyperlink"/>
@@ -2428,7 +2432,7 @@
                 <w:noProof/>
                 <w:webHidden/>
               </w:rPr>
-              <w:instrText xml:space="preserve"> PAGEREF _Toc228217452 \h </w:instrText>
+              <w:instrText xml:space="preserve"> PAGEREF _Toc228229119 \h </w:instrText>
             </w:r>
             <w:r>
               <w:rPr>
@@ -2473,7 +2477,7 @@
               <w14:ligatures w14:val="standardContextual"/>
             </w:rPr>
           </w:pPr>
-          <w:hyperlink w:anchor="_Toc228217453" w:history="1">
+          <w:hyperlink w:anchor="_Toc228229120" w:history="1">
             <w:r>
               <w:rPr>
                 <w:rStyle w:val="Hyperlink"/>
@@ -2520,7 +2524,7 @@
                 <w:noProof/>
                 <w:webHidden/>
               </w:rPr>
-              <w:instrText xml:space="preserve"> PAGEREF _Toc228217453 \h </w:instrText>
+              <w:instrText xml:space="preserve"> PAGEREF _Toc228229120 \h </w:instrText>
             </w:r>
             <w:r>
               <w:rPr>
@@ -2565,7 +2569,7 @@
               <w14:ligatures w14:val="standardContextual"/>
             </w:rPr>
           </w:pPr>
-          <w:hyperlink w:anchor="_Toc228217454" w:history="1">
+          <w:hyperlink w:anchor="_Toc228229121" w:history="1">
             <w:r>
               <w:rPr>
                 <w:rStyle w:val="Hyperlink"/>
@@ -2612,7 +2616,7 @@
                 <w:noProof/>
                 <w:webHidden/>
               </w:rPr>
-              <w:instrText xml:space="preserve"> PAGEREF _Toc228217454 \h </w:instrText>
+              <w:instrText xml:space="preserve"> PAGEREF _Toc228229121 \h </w:instrText>
             </w:r>
             <w:r>
               <w:rPr>
@@ -2657,7 +2661,7 @@
               <w14:ligatures w14:val="standardContextual"/>
             </w:rPr>
           </w:pPr>
-          <w:hyperlink w:anchor="_Toc228217455" w:history="1">
+          <w:hyperlink w:anchor="_Toc228229122" w:history="1">
             <w:r>
               <w:rPr>
                 <w:rStyle w:val="Hyperlink"/>
@@ -2704,7 +2708,7 @@
                 <w:noProof/>
                 <w:webHidden/>
               </w:rPr>
-              <w:instrText xml:space="preserve"> PAGEREF _Toc228217455 \h </w:instrText>
+              <w:instrText xml:space="preserve"> PAGEREF _Toc228229122 \h </w:instrText>
             </w:r>
             <w:r>
               <w:rPr>
@@ -2749,7 +2753,7 @@
               <w14:ligatures w14:val="standardContextual"/>
             </w:rPr>
           </w:pPr>
-          <w:hyperlink w:anchor="_Toc228217456" w:history="1">
+          <w:hyperlink w:anchor="_Toc228229123" w:history="1">
             <w:r>
               <w:rPr>
                 <w:rStyle w:val="Hyperlink"/>
@@ -2796,7 +2800,7 @@
                 <w:noProof/>
                 <w:webHidden/>
               </w:rPr>
-              <w:instrText xml:space="preserve"> PAGEREF _Toc228217456 \h </w:instrText>
+              <w:instrText xml:space="preserve"> PAGEREF _Toc228229123 \h </w:instrText>
             </w:r>
             <w:r>
               <w:rPr>
@@ -2817,6 +2821,365 @@
                 <w:webHidden/>
               </w:rPr>
               <w:t>17</w:t>
+            </w:r>
+            <w:r>
+              <w:rPr>
+                <w:noProof/>
+                <w:webHidden/>
+              </w:rPr>
+              <w:fldChar w:fldCharType="end"/>
+            </w:r>
+          </w:hyperlink>
+        </w:p>
+        <w:p>
+          <w:pPr>
+            <w:pStyle w:val="TOC2"/>
+            <w:tabs>
+              <w:tab w:val="left" w:pos="720"/>
+              <w:tab w:val="right" w:leader="dot" w:pos="9010"/>
+            </w:tabs>
+            <w:rPr>
+              <w:rFonts w:asciiTheme="minorHAnsi" w:eastAsiaTheme="minorEastAsia" w:hAnsiTheme="minorHAnsi" w:cstheme="minorBidi"/>
+              <w:noProof/>
+              <w:kern w:val="2"/>
+              <w14:ligatures w14:val="standardContextual"/>
+            </w:rPr>
+          </w:pPr>
+          <w:hyperlink w:anchor="_Toc228229124" w:history="1">
+            <w:r>
+              <w:rPr>
+                <w:rStyle w:val="Hyperlink"/>
+                <w:noProof/>
+                <w:lang w:val="vi-VN"/>
+              </w:rPr>
+              <w:t>1.</w:t>
+            </w:r>
+            <w:r>
+              <w:rPr>
+                <w:rFonts w:asciiTheme="minorHAnsi" w:eastAsiaTheme="minorEastAsia" w:hAnsiTheme="minorHAnsi" w:cstheme="minorBidi"/>
+                <w:noProof/>
+                <w:kern w:val="2"/>
+                <w14:ligatures w14:val="standardContextual"/>
+              </w:rPr>
+              <w:tab/>
+            </w:r>
+            <w:r>
+              <w:rPr>
+                <w:rStyle w:val="Hyperlink"/>
+                <w:noProof/>
+                <w:lang w:val="vi-VN"/>
+              </w:rPr>
+              <w:t>Kịch bản thử nghiệm 1</w:t>
+            </w:r>
+            <w:r>
+              <w:rPr>
+                <w:noProof/>
+                <w:webHidden/>
+              </w:rPr>
+              <w:tab/>
+            </w:r>
+            <w:r>
+              <w:rPr>
+                <w:noProof/>
+                <w:webHidden/>
+              </w:rPr>
+              <w:fldChar w:fldCharType="begin"/>
+            </w:r>
+            <w:r>
+              <w:rPr>
+                <w:noProof/>
+                <w:webHidden/>
+              </w:rPr>
+              <w:instrText xml:space="preserve"> PAGEREF _Toc228229124 \h </w:instrText>
+            </w:r>
+            <w:r>
+              <w:rPr>
+                <w:noProof/>
+                <w:webHidden/>
+              </w:rPr>
+            </w:r>
+            <w:r>
+              <w:rPr>
+                <w:noProof/>
+                <w:webHidden/>
+              </w:rPr>
+              <w:fldChar w:fldCharType="separate"/>
+            </w:r>
+            <w:r>
+              <w:rPr>
+                <w:noProof/>
+                <w:webHidden/>
+              </w:rPr>
+              <w:t>17</w:t>
+            </w:r>
+            <w:r>
+              <w:rPr>
+                <w:noProof/>
+                <w:webHidden/>
+              </w:rPr>
+              <w:fldChar w:fldCharType="end"/>
+            </w:r>
+          </w:hyperlink>
+        </w:p>
+        <w:p>
+          <w:pPr>
+            <w:pStyle w:val="TOC2"/>
+            <w:tabs>
+              <w:tab w:val="left" w:pos="720"/>
+              <w:tab w:val="right" w:leader="dot" w:pos="9010"/>
+            </w:tabs>
+            <w:rPr>
+              <w:rFonts w:asciiTheme="minorHAnsi" w:eastAsiaTheme="minorEastAsia" w:hAnsiTheme="minorHAnsi" w:cstheme="minorBidi"/>
+              <w:noProof/>
+              <w:kern w:val="2"/>
+              <w14:ligatures w14:val="standardContextual"/>
+            </w:rPr>
+          </w:pPr>
+          <w:hyperlink w:anchor="_Toc228229125" w:history="1">
+            <w:r>
+              <w:rPr>
+                <w:rStyle w:val="Hyperlink"/>
+                <w:noProof/>
+                <w:lang w:val="vi-VN"/>
+              </w:rPr>
+              <w:t>2.</w:t>
+            </w:r>
+            <w:r>
+              <w:rPr>
+                <w:rFonts w:asciiTheme="minorHAnsi" w:eastAsiaTheme="minorEastAsia" w:hAnsiTheme="minorHAnsi" w:cstheme="minorBidi"/>
+                <w:noProof/>
+                <w:kern w:val="2"/>
+                <w14:ligatures w14:val="standardContextual"/>
+              </w:rPr>
+              <w:tab/>
+            </w:r>
+            <w:r>
+              <w:rPr>
+                <w:rStyle w:val="Hyperlink"/>
+                <w:noProof/>
+                <w:lang w:val="vi-VN"/>
+              </w:rPr>
+              <w:t>Kịch bản thử nghiệm 2</w:t>
+            </w:r>
+            <w:r>
+              <w:rPr>
+                <w:noProof/>
+                <w:webHidden/>
+              </w:rPr>
+              <w:tab/>
+            </w:r>
+            <w:r>
+              <w:rPr>
+                <w:noProof/>
+                <w:webHidden/>
+              </w:rPr>
+              <w:fldChar w:fldCharType="begin"/>
+            </w:r>
+            <w:r>
+              <w:rPr>
+                <w:noProof/>
+                <w:webHidden/>
+              </w:rPr>
+              <w:instrText xml:space="preserve"> PAGEREF _Toc228229125 \h </w:instrText>
+            </w:r>
+            <w:r>
+              <w:rPr>
+                <w:noProof/>
+                <w:webHidden/>
+              </w:rPr>
+            </w:r>
+            <w:r>
+              <w:rPr>
+                <w:noProof/>
+                <w:webHidden/>
+              </w:rPr>
+              <w:fldChar w:fldCharType="separate"/>
+            </w:r>
+            <w:r>
+              <w:rPr>
+                <w:noProof/>
+                <w:webHidden/>
+              </w:rPr>
+              <w:t>18</w:t>
+            </w:r>
+            <w:r>
+              <w:rPr>
+                <w:noProof/>
+                <w:webHidden/>
+              </w:rPr>
+              <w:fldChar w:fldCharType="end"/>
+            </w:r>
+          </w:hyperlink>
+        </w:p>
+        <w:p>
+          <w:pPr>
+            <w:pStyle w:val="TOC2"/>
+            <w:tabs>
+              <w:tab w:val="left" w:pos="720"/>
+              <w:tab w:val="right" w:leader="dot" w:pos="9010"/>
+            </w:tabs>
+            <w:rPr>
+              <w:rFonts w:asciiTheme="minorHAnsi" w:eastAsiaTheme="minorEastAsia" w:hAnsiTheme="minorHAnsi" w:cstheme="minorBidi"/>
+              <w:noProof/>
+              <w:kern w:val="2"/>
+              <w14:ligatures w14:val="standardContextual"/>
+            </w:rPr>
+          </w:pPr>
+          <w:hyperlink w:anchor="_Toc228229126" w:history="1">
+            <w:r>
+              <w:rPr>
+                <w:rStyle w:val="Hyperlink"/>
+                <w:noProof/>
+              </w:rPr>
+              <w:t>3.</w:t>
+            </w:r>
+            <w:r>
+              <w:rPr>
+                <w:rFonts w:asciiTheme="minorHAnsi" w:eastAsiaTheme="minorEastAsia" w:hAnsiTheme="minorHAnsi" w:cstheme="minorBidi"/>
+                <w:noProof/>
+                <w:kern w:val="2"/>
+                <w14:ligatures w14:val="standardContextual"/>
+              </w:rPr>
+              <w:tab/>
+            </w:r>
+            <w:r>
+              <w:rPr>
+                <w:rStyle w:val="Hyperlink"/>
+                <w:noProof/>
+                <w:lang w:val="vi-VN"/>
+              </w:rPr>
+              <w:t>Kịch bản thử nghiệm 3</w:t>
+            </w:r>
+            <w:r>
+              <w:rPr>
+                <w:noProof/>
+                <w:webHidden/>
+              </w:rPr>
+              <w:tab/>
+            </w:r>
+            <w:r>
+              <w:rPr>
+                <w:noProof/>
+                <w:webHidden/>
+              </w:rPr>
+              <w:fldChar w:fldCharType="begin"/>
+            </w:r>
+            <w:r>
+              <w:rPr>
+                <w:noProof/>
+                <w:webHidden/>
+              </w:rPr>
+              <w:instrText xml:space="preserve"> PAGEREF _Toc228229126 \h </w:instrText>
+            </w:r>
+            <w:r>
+              <w:rPr>
+                <w:noProof/>
+                <w:webHidden/>
+              </w:rPr>
+            </w:r>
+            <w:r>
+              <w:rPr>
+                <w:noProof/>
+                <w:webHidden/>
+              </w:rPr>
+              <w:fldChar w:fldCharType="separate"/>
+            </w:r>
+            <w:r>
+              <w:rPr>
+                <w:noProof/>
+                <w:webHidden/>
+              </w:rPr>
+              <w:t>19</w:t>
+            </w:r>
+            <w:r>
+              <w:rPr>
+                <w:noProof/>
+                <w:webHidden/>
+              </w:rPr>
+              <w:fldChar w:fldCharType="end"/>
+            </w:r>
+          </w:hyperlink>
+        </w:p>
+        <w:p>
+          <w:pPr>
+            <w:pStyle w:val="TOC2"/>
+            <w:tabs>
+              <w:tab w:val="left" w:pos="720"/>
+              <w:tab w:val="right" w:leader="dot" w:pos="9010"/>
+            </w:tabs>
+            <w:rPr>
+              <w:rFonts w:asciiTheme="minorHAnsi" w:eastAsiaTheme="minorEastAsia" w:hAnsiTheme="minorHAnsi" w:cstheme="minorBidi"/>
+              <w:noProof/>
+              <w:kern w:val="2"/>
+              <w14:ligatures w14:val="standardContextual"/>
+            </w:rPr>
+          </w:pPr>
+          <w:hyperlink w:anchor="_Toc228229127" w:history="1">
+            <w:r>
+              <w:rPr>
+                <w:rStyle w:val="Hyperlink"/>
+                <w:noProof/>
+                <w:lang w:val="vi-VN"/>
+              </w:rPr>
+              <w:t>4.</w:t>
+            </w:r>
+            <w:r>
+              <w:rPr>
+                <w:rFonts w:asciiTheme="minorHAnsi" w:eastAsiaTheme="minorEastAsia" w:hAnsiTheme="minorHAnsi" w:cstheme="minorBidi"/>
+                <w:noProof/>
+                <w:kern w:val="2"/>
+                <w14:ligatures w14:val="standardContextual"/>
+              </w:rPr>
+              <w:tab/>
+            </w:r>
+            <w:r>
+              <w:rPr>
+                <w:rStyle w:val="Hyperlink"/>
+                <w:noProof/>
+                <w:lang w:val="vi-VN"/>
+              </w:rPr>
+              <w:t>Kết quả so sánh ba kịch bản:</w:t>
+            </w:r>
+            <w:r>
+              <w:rPr>
+                <w:noProof/>
+                <w:webHidden/>
+              </w:rPr>
+              <w:tab/>
+            </w:r>
+            <w:r>
+              <w:rPr>
+                <w:noProof/>
+                <w:webHidden/>
+              </w:rPr>
+              <w:fldChar w:fldCharType="begin"/>
+            </w:r>
+            <w:r>
+              <w:rPr>
+                <w:noProof/>
+                <w:webHidden/>
+              </w:rPr>
+              <w:instrText xml:space="preserve"> PAGEREF _Toc228229127 \h </w:instrText>
+            </w:r>
+            <w:r>
+              <w:rPr>
+                <w:noProof/>
+                <w:webHidden/>
+              </w:rPr>
+            </w:r>
+            <w:r>
+              <w:rPr>
+                <w:noProof/>
+                <w:webHidden/>
+              </w:rPr>
+              <w:fldChar w:fldCharType="separate"/>
+            </w:r>
+            <w:r>
+              <w:rPr>
+                <w:noProof/>
+                <w:webHidden/>
+              </w:rPr>
+              <w:t>20</w:t>
             </w:r>
             <w:r>
               <w:rPr>
@@ -2841,7 +3204,7 @@
               <w14:ligatures w14:val="standardContextual"/>
             </w:rPr>
           </w:pPr>
-          <w:hyperlink w:anchor="_Toc228217457" w:history="1">
+          <w:hyperlink w:anchor="_Toc228229128" w:history="1">
             <w:r>
               <w:rPr>
                 <w:rStyle w:val="Hyperlink"/>
@@ -2888,7 +3251,7 @@
                 <w:noProof/>
                 <w:webHidden/>
               </w:rPr>
-              <w:instrText xml:space="preserve"> PAGEREF _Toc228217457 \h </w:instrText>
+              <w:instrText xml:space="preserve"> PAGEREF _Toc228229128 \h </w:instrText>
             </w:r>
             <w:r>
               <w:rPr>
@@ -2908,7 +3271,7 @@
                 <w:noProof/>
                 <w:webHidden/>
               </w:rPr>
-              <w:t>18</w:t>
+              <w:t>20</w:t>
             </w:r>
             <w:r>
               <w:rPr>
@@ -2933,7 +3296,7 @@
               <w14:ligatures w14:val="standardContextual"/>
             </w:rPr>
           </w:pPr>
-          <w:hyperlink w:anchor="_Toc228217458" w:history="1">
+          <w:hyperlink w:anchor="_Toc228229129" w:history="1">
             <w:r>
               <w:rPr>
                 <w:rStyle w:val="Hyperlink"/>
@@ -2980,7 +3343,7 @@
                 <w:noProof/>
                 <w:webHidden/>
               </w:rPr>
-              <w:instrText xml:space="preserve"> PAGEREF _Toc228217458 \h </w:instrText>
+              <w:instrText xml:space="preserve"> PAGEREF _Toc228229129 \h </w:instrText>
             </w:r>
             <w:r>
               <w:rPr>
@@ -3000,7 +3363,7 @@
                 <w:noProof/>
                 <w:webHidden/>
               </w:rPr>
-              <w:t>18</w:t>
+              <w:t>20</w:t>
             </w:r>
             <w:r>
               <w:rPr>
@@ -3066,7 +3429,7 @@
           <w:szCs w:val="28"/>
         </w:rPr>
       </w:pPr>
-      <w:bookmarkStart w:id="0" w:name="_Toc228217436"/>
+      <w:bookmarkStart w:id="0" w:name="_Toc228229103"/>
       <w:r>
         <w:rPr>
           <w:b/>
@@ -3208,7 +3571,7 @@
           <w:szCs w:val="28"/>
         </w:rPr>
       </w:pPr>
-      <w:bookmarkStart w:id="1" w:name="_Toc228217437"/>
+      <w:bookmarkStart w:id="1" w:name="_Toc228229104"/>
       <w:r>
         <w:rPr>
           <w:b/>
@@ -3237,7 +3600,7 @@
           <w:szCs w:val="26"/>
         </w:rPr>
       </w:pPr>
-      <w:bookmarkStart w:id="2" w:name="_Toc228217438"/>
+      <w:bookmarkStart w:id="2" w:name="_Toc228229105"/>
       <w:r>
         <w:rPr>
           <w:b/>
@@ -3330,7 +3693,7 @@
           <w:szCs w:val="26"/>
         </w:rPr>
       </w:pPr>
-      <w:bookmarkStart w:id="3" w:name="_Toc228217439"/>
+      <w:bookmarkStart w:id="3" w:name="_Toc228229106"/>
       <w:r>
         <w:rPr>
           <w:b/>
@@ -3431,7 +3794,7 @@
           <w:szCs w:val="26"/>
         </w:rPr>
       </w:pPr>
-      <w:bookmarkStart w:id="4" w:name="_Toc228217440"/>
+      <w:bookmarkStart w:id="4" w:name="_Toc228229107"/>
       <w:r>
         <w:rPr>
           <w:b/>
@@ -3524,7 +3887,7 @@
           <w:szCs w:val="26"/>
         </w:rPr>
       </w:pPr>
-      <w:bookmarkStart w:id="5" w:name="_Toc228217441"/>
+      <w:bookmarkStart w:id="5" w:name="_Toc228229108"/>
       <w:r>
         <w:rPr>
           <w:b/>
@@ -3617,7 +3980,7 @@
           <w:szCs w:val="26"/>
         </w:rPr>
       </w:pPr>
-      <w:bookmarkStart w:id="6" w:name="_Toc228217442"/>
+      <w:bookmarkStart w:id="6" w:name="_Toc228229109"/>
       <w:r>
         <w:rPr>
           <w:b/>
@@ -3682,7 +4045,7 @@
           <w:szCs w:val="28"/>
         </w:rPr>
       </w:pPr>
-      <w:bookmarkStart w:id="7" w:name="_Toc228217443"/>
+      <w:bookmarkStart w:id="7" w:name="_Toc228229110"/>
       <w:r>
         <w:rPr>
           <w:b/>
@@ -4306,7 +4669,7 @@
           <w:szCs w:val="26"/>
         </w:rPr>
       </w:pPr>
-      <w:bookmarkStart w:id="8" w:name="_Toc228217444"/>
+      <w:bookmarkStart w:id="8" w:name="_Toc228229111"/>
       <w:r>
         <w:rPr>
           <w:b/>
@@ -4833,24 +5196,14 @@
       <w:r>
         <w:t xml:space="preserve">Hình </w:t>
       </w:r>
-      <w:r>
-        <w:fldChar w:fldCharType="begin"/>
-      </w:r>
-      <w:r>
-        <w:instrText xml:space="preserve"> SEQ Hình \* ARABIC </w:instrText>
-      </w:r>
-      <w:r>
-        <w:fldChar w:fldCharType="separate"/>
-      </w:r>
-      <w:r>
-        <w:rPr>
-          <w:noProof/>
-        </w:rPr>
-        <w:t>1</w:t>
-      </w:r>
-      <w:r>
-        <w:fldChar w:fldCharType="end"/>
-      </w:r>
+      <w:fldSimple w:instr=" SEQ Hình \* ARABIC ">
+        <w:r>
+          <w:rPr>
+            <w:noProof/>
+          </w:rPr>
+          <w:t>1</w:t>
+        </w:r>
+      </w:fldSimple>
       <w:r>
         <w:t>. Phân phối số từ trong câu của tập train.</w:t>
       </w:r>
@@ -4977,24 +5330,14 @@
       <w:r>
         <w:t xml:space="preserve">Hình </w:t>
       </w:r>
-      <w:r>
-        <w:fldChar w:fldCharType="begin"/>
-      </w:r>
-      <w:r>
-        <w:instrText xml:space="preserve"> SEQ Hình \* ARABIC </w:instrText>
-      </w:r>
-      <w:r>
-        <w:fldChar w:fldCharType="separate"/>
-      </w:r>
-      <w:r>
-        <w:rPr>
-          <w:noProof/>
-        </w:rPr>
-        <w:t>2</w:t>
-      </w:r>
-      <w:r>
-        <w:fldChar w:fldCharType="end"/>
-      </w:r>
+      <w:fldSimple w:instr=" SEQ Hình \* ARABIC ">
+        <w:r>
+          <w:rPr>
+            <w:noProof/>
+          </w:rPr>
+          <w:t>2</w:t>
+        </w:r>
+      </w:fldSimple>
       <w:r>
         <w:t xml:space="preserve">. </w:t>
       </w:r>
@@ -5094,24 +5437,14 @@
       <w:r>
         <w:t xml:space="preserve">Hình </w:t>
       </w:r>
-      <w:r>
-        <w:fldChar w:fldCharType="begin"/>
-      </w:r>
-      <w:r>
-        <w:instrText xml:space="preserve"> SEQ Hình \* ARABIC </w:instrText>
-      </w:r>
-      <w:r>
-        <w:fldChar w:fldCharType="separate"/>
-      </w:r>
-      <w:r>
-        <w:rPr>
-          <w:noProof/>
-        </w:rPr>
-        <w:t>3</w:t>
-      </w:r>
-      <w:r>
-        <w:fldChar w:fldCharType="end"/>
-      </w:r>
+      <w:fldSimple w:instr=" SEQ Hình \* ARABIC ">
+        <w:r>
+          <w:rPr>
+            <w:noProof/>
+          </w:rPr>
+          <w:t>3</w:t>
+        </w:r>
+      </w:fldSimple>
       <w:r>
         <w:t>. Phân bố tần suất của từ tiếng Anh (train).</w:t>
       </w:r>
@@ -5178,24 +5511,14 @@
       <w:r>
         <w:t xml:space="preserve">Hình </w:t>
       </w:r>
-      <w:r>
-        <w:fldChar w:fldCharType="begin"/>
-      </w:r>
-      <w:r>
-        <w:instrText xml:space="preserve"> SEQ Hình \* ARABIC </w:instrText>
-      </w:r>
-      <w:r>
-        <w:fldChar w:fldCharType="separate"/>
-      </w:r>
-      <w:r>
-        <w:rPr>
-          <w:noProof/>
-        </w:rPr>
-        <w:t>4</w:t>
-      </w:r>
-      <w:r>
-        <w:fldChar w:fldCharType="end"/>
-      </w:r>
+      <w:fldSimple w:instr=" SEQ Hình \* ARABIC ">
+        <w:r>
+          <w:rPr>
+            <w:noProof/>
+          </w:rPr>
+          <w:t>4</w:t>
+        </w:r>
+      </w:fldSimple>
       <w:r>
         <w:t xml:space="preserve">. </w:t>
       </w:r>
@@ -5237,7 +5560,7 @@
           <w:szCs w:val="26"/>
         </w:rPr>
       </w:pPr>
-      <w:bookmarkStart w:id="9" w:name="_Toc228217445"/>
+      <w:bookmarkStart w:id="9" w:name="_Toc228229112"/>
       <w:r>
         <w:rPr>
           <w:b/>
@@ -6962,7 +7285,7 @@
           <w:lang w:val="sv-SE"/>
         </w:rPr>
       </w:pPr>
-      <w:bookmarkStart w:id="10" w:name="_Toc228217446"/>
+      <w:bookmarkStart w:id="10" w:name="_Toc228229113"/>
       <w:r>
         <w:rPr>
           <w:b/>
@@ -6992,7 +7315,7 @@
           <w:szCs w:val="26"/>
         </w:rPr>
       </w:pPr>
-      <w:bookmarkStart w:id="11" w:name="_Toc228217447"/>
+      <w:bookmarkStart w:id="11" w:name="_Toc228229114"/>
       <w:r>
         <w:rPr>
           <w:b/>
@@ -7051,7 +7374,7 @@
           <w:szCs w:val="26"/>
         </w:rPr>
       </w:pPr>
-      <w:bookmarkStart w:id="12" w:name="_Toc228217448"/>
+      <w:bookmarkStart w:id="12" w:name="_Toc228229115"/>
       <w:r>
         <w:rPr>
           <w:b/>
@@ -7125,24 +7448,14 @@
       <w:r>
         <w:t xml:space="preserve">Hình </w:t>
       </w:r>
-      <w:r>
-        <w:fldChar w:fldCharType="begin"/>
-      </w:r>
-      <w:r>
-        <w:instrText xml:space="preserve"> SEQ Hình \* ARABIC </w:instrText>
-      </w:r>
-      <w:r>
-        <w:fldChar w:fldCharType="separate"/>
-      </w:r>
-      <w:r>
-        <w:rPr>
-          <w:noProof/>
-        </w:rPr>
-        <w:t>5</w:t>
-      </w:r>
-      <w:r>
-        <w:fldChar w:fldCharType="end"/>
-      </w:r>
+      <w:fldSimple w:instr=" SEQ Hình \* ARABIC ">
+        <w:r>
+          <w:rPr>
+            <w:noProof/>
+          </w:rPr>
+          <w:t>5</w:t>
+        </w:r>
+      </w:fldSimple>
       <w:r>
         <w:t>. Kiến trúc mô hình sequence to sequence.</w:t>
       </w:r>
@@ -7260,7 +7573,7 @@
           <w:szCs w:val="26"/>
         </w:rPr>
       </w:pPr>
-      <w:bookmarkStart w:id="13" w:name="_Toc228217449"/>
+      <w:bookmarkStart w:id="13" w:name="_Toc228229116"/>
       <w:r>
         <w:rPr>
           <w:b/>
@@ -7669,24 +7982,14 @@
       <w:r>
         <w:t xml:space="preserve">Hình </w:t>
       </w:r>
-      <w:r>
-        <w:fldChar w:fldCharType="begin"/>
-      </w:r>
-      <w:r>
-        <w:instrText xml:space="preserve"> SEQ Hình \* ARABIC </w:instrText>
-      </w:r>
-      <w:r>
-        <w:fldChar w:fldCharType="separate"/>
-      </w:r>
-      <w:r>
-        <w:rPr>
-          <w:noProof/>
-        </w:rPr>
-        <w:t>6</w:t>
-      </w:r>
-      <w:r>
-        <w:fldChar w:fldCharType="end"/>
-      </w:r>
+      <w:fldSimple w:instr=" SEQ Hình \* ARABIC ">
+        <w:r>
+          <w:rPr>
+            <w:noProof/>
+          </w:rPr>
+          <w:t>6</w:t>
+        </w:r>
+      </w:fldSimple>
       <w:r>
         <w:t>. Mô tả hoạt động của encoder.</w:t>
       </w:r>
@@ -7819,7 +8122,6 @@
         <w:rPr>
           <w:sz w:val="26"/>
           <w:szCs w:val="26"/>
-          <w:lang w:val="it-IT"/>
         </w:rPr>
         <w:tab/>
         <w:t>​</w:t>
@@ -7929,7 +8231,7 @@
           <w:szCs w:val="26"/>
         </w:rPr>
       </w:pPr>
-      <w:bookmarkStart w:id="14" w:name="_Toc228217450"/>
+      <w:bookmarkStart w:id="14" w:name="_Toc228229117"/>
       <w:r>
         <w:rPr>
           <w:b/>
@@ -8356,6 +8658,9 @@
             <m:t>)</m:t>
           </m:r>
           <m:r>
+            <m:rPr>
+              <m:sty m:val="p"/>
+            </m:rPr>
             <w:rPr>
               <w:sz w:val="26"/>
               <w:szCs w:val="26"/>
@@ -8584,24 +8889,14 @@
       <w:r>
         <w:t xml:space="preserve">Hình </w:t>
       </w:r>
-      <w:r>
-        <w:fldChar w:fldCharType="begin"/>
-      </w:r>
-      <w:r>
-        <w:instrText xml:space="preserve"> SEQ Hình \* ARABIC </w:instrText>
-      </w:r>
-      <w:r>
-        <w:fldChar w:fldCharType="separate"/>
-      </w:r>
-      <w:r>
-        <w:rPr>
-          <w:noProof/>
-        </w:rPr>
-        <w:t>7</w:t>
-      </w:r>
-      <w:r>
-        <w:fldChar w:fldCharType="end"/>
-      </w:r>
+      <w:fldSimple w:instr=" SEQ Hình \* ARABIC ">
+        <w:r>
+          <w:rPr>
+            <w:noProof/>
+          </w:rPr>
+          <w:t>7</w:t>
+        </w:r>
+      </w:fldSimple>
       <w:r>
         <w:t xml:space="preserve">. Mô tả hoạt động của </w:t>
       </w:r>
@@ -8710,7 +9005,7 @@
           <w:szCs w:val="26"/>
         </w:rPr>
       </w:pPr>
-      <w:bookmarkStart w:id="15" w:name="_Toc228217451"/>
+      <w:bookmarkStart w:id="15" w:name="_Toc228229118"/>
       <w:r>
         <w:rPr>
           <w:b/>
@@ -8751,7 +9046,7 @@
           <w:szCs w:val="26"/>
         </w:rPr>
       </w:pPr>
-      <w:bookmarkStart w:id="16" w:name="_Toc228217452"/>
+      <w:bookmarkStart w:id="16" w:name="_Toc228229119"/>
       <w:r>
         <w:rPr>
           <w:b/>
@@ -8933,24 +9228,14 @@
       <w:r>
         <w:t xml:space="preserve">Hình </w:t>
       </w:r>
-      <w:r>
-        <w:fldChar w:fldCharType="begin"/>
-      </w:r>
-      <w:r>
-        <w:instrText xml:space="preserve"> SEQ Hình \* ARABIC </w:instrText>
-      </w:r>
-      <w:r>
-        <w:fldChar w:fldCharType="separate"/>
-      </w:r>
-      <w:r>
-        <w:rPr>
-          <w:noProof/>
-        </w:rPr>
-        <w:t>8</w:t>
-      </w:r>
-      <w:r>
-        <w:fldChar w:fldCharType="end"/>
-      </w:r>
+      <w:fldSimple w:instr=" SEQ Hình \* ARABIC ">
+        <w:r>
+          <w:rPr>
+            <w:noProof/>
+          </w:rPr>
+          <w:t>8</w:t>
+        </w:r>
+      </w:fldSimple>
       <w:r>
         <w:t>. Kiến trúc mô hình Transformer.</w:t>
       </w:r>
@@ -9034,24 +9319,14 @@
       <w:r>
         <w:t xml:space="preserve">Hình </w:t>
       </w:r>
-      <w:r>
-        <w:fldChar w:fldCharType="begin"/>
-      </w:r>
-      <w:r>
-        <w:instrText xml:space="preserve"> SEQ Hình \* ARABIC </w:instrText>
-      </w:r>
-      <w:r>
-        <w:fldChar w:fldCharType="separate"/>
-      </w:r>
-      <w:r>
-        <w:rPr>
-          <w:noProof/>
-        </w:rPr>
-        <w:t>9</w:t>
-      </w:r>
-      <w:r>
-        <w:fldChar w:fldCharType="end"/>
-      </w:r>
+      <w:fldSimple w:instr=" SEQ Hình \* ARABIC ">
+        <w:r>
+          <w:rPr>
+            <w:noProof/>
+          </w:rPr>
+          <w:t>9</w:t>
+        </w:r>
+      </w:fldSimple>
       <w:r>
         <w:t>. Mô hình Transformer khác phục hạn chế LSTM bằng khả năng xử lý song song.</w:t>
       </w:r>
@@ -9129,24 +9404,14 @@
       <w:r>
         <w:t xml:space="preserve">Hình </w:t>
       </w:r>
-      <w:r>
-        <w:fldChar w:fldCharType="begin"/>
-      </w:r>
-      <w:r>
-        <w:instrText xml:space="preserve"> SEQ Hình \* ARABIC </w:instrText>
-      </w:r>
-      <w:r>
-        <w:fldChar w:fldCharType="separate"/>
-      </w:r>
-      <w:r>
-        <w:rPr>
-          <w:noProof/>
-        </w:rPr>
-        <w:t>10</w:t>
-      </w:r>
-      <w:r>
-        <w:fldChar w:fldCharType="end"/>
-      </w:r>
+      <w:fldSimple w:instr=" SEQ Hình \* ARABIC ">
+        <w:r>
+          <w:rPr>
+            <w:noProof/>
+          </w:rPr>
+          <w:t>10</w:t>
+        </w:r>
+      </w:fldSimple>
       <w:r>
         <w:t>. Kiến trúc chi tiết của mô hình Transformer.</w:t>
       </w:r>
@@ -9182,7 +9447,7 @@
           <w:szCs w:val="26"/>
         </w:rPr>
       </w:pPr>
-      <w:bookmarkStart w:id="17" w:name="_Toc228217453"/>
+      <w:bookmarkStart w:id="17" w:name="_Toc228229120"/>
       <w:r>
         <w:rPr>
           <w:b/>
@@ -9287,24 +9552,14 @@
       <w:r>
         <w:t xml:space="preserve">Hình </w:t>
       </w:r>
-      <w:r>
-        <w:fldChar w:fldCharType="begin"/>
-      </w:r>
-      <w:r>
-        <w:instrText xml:space="preserve"> SEQ Hình \* ARABIC </w:instrText>
-      </w:r>
-      <w:r>
-        <w:fldChar w:fldCharType="separate"/>
-      </w:r>
-      <w:r>
-        <w:rPr>
-          <w:noProof/>
-        </w:rPr>
-        <w:t>11</w:t>
-      </w:r>
-      <w:r>
-        <w:fldChar w:fldCharType="end"/>
-      </w:r>
+      <w:fldSimple w:instr=" SEQ Hình \* ARABIC ">
+        <w:r>
+          <w:rPr>
+            <w:noProof/>
+          </w:rPr>
+          <w:t>11</w:t>
+        </w:r>
+      </w:fldSimple>
       <w:r>
         <w:t>. Thêm thông tin về vị trí của từng từ trước khi đưa vào Encoder.</w:t>
       </w:r>
@@ -10082,7 +10337,7 @@
           <w:szCs w:val="26"/>
         </w:rPr>
       </w:pPr>
-      <w:bookmarkStart w:id="18" w:name="_Toc228217454"/>
+      <w:bookmarkStart w:id="18" w:name="_Toc228229121"/>
       <w:r>
         <w:rPr>
           <w:b/>
@@ -10249,24 +10504,14 @@
       <w:r>
         <w:t xml:space="preserve">Hình </w:t>
       </w:r>
-      <w:r>
-        <w:fldChar w:fldCharType="begin"/>
-      </w:r>
-      <w:r>
-        <w:instrText xml:space="preserve"> SEQ Hình \* ARABIC </w:instrText>
-      </w:r>
-      <w:r>
-        <w:fldChar w:fldCharType="separate"/>
-      </w:r>
-      <w:r>
-        <w:rPr>
-          <w:noProof/>
-        </w:rPr>
-        <w:t>12</w:t>
-      </w:r>
-      <w:r>
-        <w:fldChar w:fldCharType="end"/>
-      </w:r>
+      <w:fldSimple w:instr=" SEQ Hình \* ARABIC ">
+        <w:r>
+          <w:rPr>
+            <w:noProof/>
+          </w:rPr>
+          <w:t>12</w:t>
+        </w:r>
+      </w:fldSimple>
       <w:r>
         <w:t>. Mô tả một encoder layer.</w:t>
       </w:r>
@@ -10481,24 +10726,14 @@
       <w:r>
         <w:t xml:space="preserve">Hình </w:t>
       </w:r>
-      <w:r>
-        <w:fldChar w:fldCharType="begin"/>
-      </w:r>
-      <w:r>
-        <w:instrText xml:space="preserve"> SEQ Hình \* ARABIC </w:instrText>
-      </w:r>
-      <w:r>
-        <w:fldChar w:fldCharType="separate"/>
-      </w:r>
-      <w:r>
-        <w:rPr>
-          <w:noProof/>
-        </w:rPr>
-        <w:t>13</w:t>
-      </w:r>
-      <w:r>
-        <w:fldChar w:fldCharType="end"/>
-      </w:r>
+      <w:fldSimple w:instr=" SEQ Hình \* ARABIC ">
+        <w:r>
+          <w:rPr>
+            <w:noProof/>
+          </w:rPr>
+          <w:t>13</w:t>
+        </w:r>
+      </w:fldSimple>
       <w:r>
         <w:t>. Mô tả seft-attention cho một từ trong câu với các từ còn lại.</w:t>
       </w:r>
@@ -10604,24 +10839,14 @@
       <w:r>
         <w:t xml:space="preserve">Hình </w:t>
       </w:r>
-      <w:r>
-        <w:fldChar w:fldCharType="begin"/>
-      </w:r>
-      <w:r>
-        <w:instrText xml:space="preserve"> SEQ Hình \* ARABIC </w:instrText>
-      </w:r>
-      <w:r>
-        <w:fldChar w:fldCharType="separate"/>
-      </w:r>
-      <w:r>
-        <w:rPr>
-          <w:noProof/>
-        </w:rPr>
-        <w:t>14</w:t>
-      </w:r>
-      <w:r>
-        <w:fldChar w:fldCharType="end"/>
-      </w:r>
+      <w:fldSimple w:instr=" SEQ Hình \* ARABIC ">
+        <w:r>
+          <w:rPr>
+            <w:noProof/>
+          </w:rPr>
+          <w:t>14</w:t>
+        </w:r>
+      </w:fldSimple>
       <w:r>
         <w:t>. Tính toán attention vector.</w:t>
       </w:r>
@@ -10728,24 +10953,14 @@
       <w:r>
         <w:t xml:space="preserve">Hình </w:t>
       </w:r>
-      <w:r>
-        <w:fldChar w:fldCharType="begin"/>
-      </w:r>
-      <w:r>
-        <w:instrText xml:space="preserve"> SEQ Hình \* ARABIC </w:instrText>
-      </w:r>
-      <w:r>
-        <w:fldChar w:fldCharType="separate"/>
-      </w:r>
-      <w:r>
-        <w:rPr>
-          <w:noProof/>
-        </w:rPr>
-        <w:t>15</w:t>
-      </w:r>
-      <w:r>
-        <w:fldChar w:fldCharType="end"/>
-      </w:r>
+      <w:fldSimple w:instr=" SEQ Hình \* ARABIC ">
+        <w:r>
+          <w:rPr>
+            <w:noProof/>
+          </w:rPr>
+          <w:t>15</w:t>
+        </w:r>
+      </w:fldSimple>
       <w:r>
         <w:t>. Multi-head attention với nhiều head attention song song.</w:t>
       </w:r>
@@ -10780,7 +10995,7 @@
           <w:szCs w:val="26"/>
         </w:rPr>
       </w:pPr>
-      <w:bookmarkStart w:id="19" w:name="_Toc228217455"/>
+      <w:bookmarkStart w:id="19" w:name="_Toc228229122"/>
       <w:r>
         <w:rPr>
           <w:b/>
@@ -10992,24 +11207,14 @@
       <w:r>
         <w:t xml:space="preserve">Hình </w:t>
       </w:r>
-      <w:r>
-        <w:fldChar w:fldCharType="begin"/>
-      </w:r>
-      <w:r>
-        <w:instrText xml:space="preserve"> SEQ Hình \* ARABIC </w:instrText>
-      </w:r>
-      <w:r>
-        <w:fldChar w:fldCharType="separate"/>
-      </w:r>
-      <w:r>
-        <w:rPr>
-          <w:noProof/>
-        </w:rPr>
-        <w:t>16</w:t>
-      </w:r>
-      <w:r>
-        <w:fldChar w:fldCharType="end"/>
-      </w:r>
+      <w:fldSimple w:instr=" SEQ Hình \* ARABIC ">
+        <w:r>
+          <w:rPr>
+            <w:noProof/>
+          </w:rPr>
+          <w:t>16</w:t>
+        </w:r>
+      </w:fldSimple>
       <w:r>
         <w:t>. Mô tả một layer decoder.</w:t>
       </w:r>
@@ -11049,7 +11254,7 @@
           <w:szCs w:val="28"/>
         </w:rPr>
       </w:pPr>
-      <w:bookmarkStart w:id="20" w:name="_Toc228217456"/>
+      <w:bookmarkStart w:id="20" w:name="_Toc228229123"/>
       <w:r>
         <w:rPr>
           <w:b/>
@@ -11064,104 +11269,204 @@
     <w:p>
       <w:pPr>
         <w:pStyle w:val="Heading2"/>
+        <w:numPr>
+          <w:ilvl w:val="1"/>
+          <w:numId w:val="48"/>
+        </w:numPr>
+        <w:spacing w:before="0" w:line="312" w:lineRule="auto"/>
+        <w:ind w:left="720"/>
         <w:rPr>
           <w:lang w:val="vi-VN"/>
         </w:rPr>
       </w:pPr>
+      <w:bookmarkStart w:id="21" w:name="_Toc228229124"/>
       <w:r>
         <w:rPr>
           <w:lang w:val="vi-VN"/>
         </w:rPr>
-        <w:t>1</w:t>
-      </w:r>
+        <w:t xml:space="preserve">Kịch bản thử nghiệm </w:t>
+      </w:r>
+      <w:bookmarkEnd w:id="21"/>
       <w:r>
         <w:rPr>
           <w:lang w:val="vi-VN"/>
         </w:rPr>
-        <w:t xml:space="preserve">. Kịch bản thử nghiệm </w:t>
-      </w:r>
-      <w:r>
+        <w:t>Seq2Seq</w:t>
+      </w:r>
+    </w:p>
+    <w:p>
+      <w:pPr>
+        <w:spacing w:line="312" w:lineRule="auto"/>
+        <w:ind w:firstLine="360"/>
+        <w:jc w:val="both"/>
         <w:rPr>
           <w:lang w:val="vi-VN"/>
         </w:rPr>
-        <w:t>1</w:t>
-      </w:r>
-    </w:p>
-    <w:p>
-      <w:pPr>
+      </w:pPr>
+      <w:r>
         <w:rPr>
           <w:lang w:val="vi-VN"/>
         </w:rPr>
-      </w:pPr>
+        <w:t xml:space="preserve">Ngôn ngữ nguồn được xử lý bằng bộ tách từ </w:t>
+      </w:r>
+      <m:oMath>
+        <m:r>
+          <w:rPr>
+            <w:rFonts w:ascii="Cambria Math" w:hAnsi="Cambria Math"/>
+            <w:lang w:val="vi-VN"/>
+          </w:rPr>
+          <m:t>en_core_web_sm</m:t>
+        </m:r>
+      </m:oMath>
       <w:r>
         <w:rPr>
           <w:lang w:val="vi-VN"/>
         </w:rPr>
-        <w:t>Ngôn ngữ nguồn sử dụng bộ tách từ en_core_web_sm và ngôn ngữ đích sử dụng vi_core_news_lg. Độ dài tối đa của mỗi câu được giới hạn ở max_strlen = 160, nhằm đảm bảo các chuỗi đầu vào và đầu ra không vượt quá ngưỡng này trong quá trình huấn luyện. Kích thước batch được thiết lập là batchsize = 1500, và quá trình huấn luyện được thực hiện trên thiết bị device = cuda.</w:t>
-      </w:r>
-    </w:p>
-    <w:p>
-      <w:pPr>
+        <w:t xml:space="preserve">, trong khi ngôn ngữ đích sử dụng </w:t>
+      </w:r>
+      <m:oMath>
+        <m:r>
+          <w:rPr>
+            <w:rFonts w:ascii="Cambria Math" w:hAnsi="Cambria Math"/>
+            <w:lang w:val="vi-VN"/>
+          </w:rPr>
+          <m:t>vi_core_news_lg</m:t>
+        </m:r>
+      </m:oMath>
+      <w:r>
         <w:rPr>
           <w:lang w:val="vi-VN"/>
         </w:rPr>
-      </w:pPr>
-    </w:p>
-    <w:p>
-      <w:pPr>
+        <w:t xml:space="preserve"> nhằm đảm bảo việc phân tách từ phù hợp với đặc trưng của từng ngôn ngữ. Độ dài tối đa của mỗi câu được giới hạn ở </w:t>
+      </w:r>
+      <m:oMath>
+        <m:r>
+          <w:rPr>
+            <w:rFonts w:ascii="Cambria Math" w:hAnsi="Cambria Math"/>
+            <w:lang w:val="vi-VN"/>
+          </w:rPr>
+          <m:t>160 token</m:t>
+        </m:r>
+      </m:oMath>
+      <w:r>
         <w:rPr>
           <w:lang w:val="vi-VN"/>
         </w:rPr>
-      </w:pPr>
-      <w:r>
+        <w:t>, giúp kiểm soát kích thước đầu vào và đầu ra trong quá trình huấn luyện.</w:t>
+      </w:r>
+    </w:p>
+    <w:p>
+      <w:pPr>
+        <w:spacing w:line="312" w:lineRule="auto"/>
+        <w:ind w:firstLine="360"/>
+        <w:jc w:val="both"/>
         <w:rPr>
           <w:lang w:val="vi-VN"/>
         </w:rPr>
-        <w:t>Ở phía mô hình, kích thước vector embedding của encoder là encoder_embedding_dim = 256 và của decoder là decoder_embedding_dim = 256. Số chiều của trạng thái ẩn trong mạng là hidden_dim = 512. Mô hình sử dụng n_layers = 2 lớp cho cả encoder và decoder. Tỷ lệ dropout của encoder là encoder_dropout = 0.5 và của decoder là decoder_dropout = 0.5.</w:t>
-      </w:r>
-    </w:p>
-    <w:p>
-      <w:pPr>
+      </w:pPr>
+      <w:r>
         <w:rPr>
           <w:lang w:val="vi-VN"/>
         </w:rPr>
-      </w:pPr>
-    </w:p>
-    <w:p>
-      <w:pPr>
+        <w:t xml:space="preserve">Dữ liệu được chia theo batch với kích thước </w:t>
+      </w:r>
+      <m:oMath>
+        <m:r>
+          <w:rPr>
+            <w:rFonts w:ascii="Cambria Math" w:hAnsi="Cambria Math"/>
+            <w:lang w:val="vi-VN"/>
+          </w:rPr>
+          <m:t>1500</m:t>
+        </m:r>
+      </m:oMath>
+      <w:r>
         <w:rPr>
           <w:lang w:val="vi-VN"/>
         </w:rPr>
-      </w:pPr>
-      <w:r>
+        <w:t>, và toàn bộ quá trình huấn luyện được thực hiện trên GPU (CUDA) nhằm tăng tốc độ tính toán.</w:t>
+      </w:r>
+    </w:p>
+    <w:p>
+      <w:pPr>
+        <w:spacing w:line="312" w:lineRule="auto"/>
+        <w:ind w:firstLine="360"/>
+        <w:jc w:val="both"/>
         <w:rPr>
           <w:lang w:val="vi-VN"/>
         </w:rPr>
-        <w:t xml:space="preserve">Quá trình tối ưu sử dụng tốc độ học lr = 0.001, với số vòng lặp huấn luyện là epochs = </w:t>
-      </w:r>
+      </w:pPr>
       <w:r>
         <w:rPr>
           <w:lang w:val="vi-VN"/>
         </w:rPr>
-        <w:t>11</w:t>
-      </w:r>
+        <w:t xml:space="preserve">Về kiến trúc mô hình, vector embedding của encoder và decoder đều có kích thước </w:t>
+      </w:r>
+      <m:oMath>
+        <m:r>
+          <w:rPr>
+            <w:rFonts w:ascii="Cambria Math" w:hAnsi="Cambria Math"/>
+            <w:lang w:val="vi-VN"/>
+          </w:rPr>
+          <m:t>256</m:t>
+        </m:r>
+      </m:oMath>
       <w:r>
         <w:rPr>
           <w:lang w:val="vi-VN"/>
         </w:rPr>
-        <w:t>. Giá trị clip = 1 được sử dụng để giới hạn gradient trong quá trình lan truyền ngược. Tỷ lệ teacher forcing được đặt là teacher_forcing_ratio = 0.5</w:t>
-      </w:r>
-    </w:p>
-    <w:p>
-      <w:pPr>
+        <w:t xml:space="preserve"> chiều, trong khi hidden state được thiết lập ở mức </w:t>
+      </w:r>
+      <m:oMath>
+        <m:r>
+          <w:rPr>
+            <w:rFonts w:ascii="Cambria Math" w:hAnsi="Cambria Math"/>
+            <w:lang w:val="vi-VN"/>
+          </w:rPr>
+          <m:t>512</m:t>
+        </m:r>
+      </m:oMath>
+      <w:r>
         <w:rPr>
           <w:lang w:val="vi-VN"/>
         </w:rPr>
-      </w:pPr>
+        <w:t xml:space="preserve"> chiều. Mô hình bao gồm </w:t>
+      </w:r>
+      <m:oMath>
+        <m:r>
+          <w:rPr>
+            <w:rFonts w:ascii="Cambria Math" w:hAnsi="Cambria Math"/>
+            <w:lang w:val="vi-VN"/>
+          </w:rPr>
+          <m:t>2</m:t>
+        </m:r>
+      </m:oMath>
+      <w:r>
+        <w:rPr>
+          <w:lang w:val="vi-VN"/>
+        </w:rPr>
+        <w:t xml:space="preserve"> lớp (layers) cho cả encoder và decoder. Để giảm hiện tượng overfitting, dropout được áp dụng với tỷ lệ </w:t>
+      </w:r>
+      <m:oMath>
+        <m:r>
+          <w:rPr>
+            <w:rFonts w:ascii="Cambria Math" w:hAnsi="Cambria Math"/>
+            <w:lang w:val="vi-VN"/>
+          </w:rPr>
+          <m:t>0.5</m:t>
+        </m:r>
+      </m:oMath>
+      <w:r>
+        <w:rPr>
+          <w:lang w:val="vi-VN"/>
+        </w:rPr>
+        <w:t xml:space="preserve"> cho cả hai phía encoder và decoder.</w:t>
+      </w:r>
     </w:p>
     <w:p>
       <w:pPr>
         <w:spacing w:line="312" w:lineRule="auto"/>
+        <w:ind w:firstLine="360"/>
+        <w:jc w:val="both"/>
         <w:rPr>
           <w:lang w:val="vi-VN"/>
         </w:rPr>
@@ -11170,12 +11475,74 @@
         <w:rPr>
           <w:lang w:val="vi-VN"/>
         </w:rPr>
-        <w:t>Kết quả thử nghiệm: BLEU trên tập Test = 0.1128</w:t>
+        <w:t xml:space="preserve">Quá trình tối ưu sử dụng learning rate </w:t>
+      </w:r>
+      <m:oMath>
+        <m:r>
+          <w:rPr>
+            <w:rFonts w:ascii="Cambria Math" w:hAnsi="Cambria Math"/>
+            <w:lang w:val="vi-VN"/>
+          </w:rPr>
+          <m:t>0.001</m:t>
+        </m:r>
+      </m:oMath>
+      <w:r>
+        <w:rPr>
+          <w:lang w:val="vi-VN"/>
+        </w:rPr>
+        <w:t xml:space="preserve">, với tổng số </w:t>
+      </w:r>
+      <m:oMath>
+        <m:r>
+          <w:rPr>
+            <w:rFonts w:ascii="Cambria Math" w:hAnsi="Cambria Math"/>
+            <w:lang w:val="vi-VN"/>
+          </w:rPr>
+          <m:t>11</m:t>
+        </m:r>
+      </m:oMath>
+      <w:r>
+        <w:rPr>
+          <w:lang w:val="vi-VN"/>
+        </w:rPr>
+        <w:t xml:space="preserve"> epochs huấn luyện. Ngoài ra, gradient clipping với giá trị </w:t>
+      </w:r>
+      <m:oMath>
+        <m:r>
+          <w:rPr>
+            <w:rFonts w:ascii="Cambria Math" w:hAnsi="Cambria Math"/>
+            <w:lang w:val="vi-VN"/>
+          </w:rPr>
+          <m:t>1.0</m:t>
+        </m:r>
+      </m:oMath>
+      <w:r>
+        <w:rPr>
+          <w:lang w:val="vi-VN"/>
+        </w:rPr>
+        <w:t xml:space="preserve"> được áp dụng nhằm ổn định quá trình lan truyền ngược. Trong quá trình huấn luyện, kỹ thuật teacher forcing được sử dụng với tỷ lệ </w:t>
+      </w:r>
+      <m:oMath>
+        <m:r>
+          <w:rPr>
+            <w:rFonts w:ascii="Cambria Math" w:hAnsi="Cambria Math"/>
+            <w:lang w:val="vi-VN"/>
+          </w:rPr>
+          <m:t>0.5</m:t>
+        </m:r>
+      </m:oMath>
+      <w:r>
+        <w:rPr>
+          <w:lang w:val="vi-VN"/>
+        </w:rPr>
+        <w:t xml:space="preserve"> để cải thiện khả năng hội tụ của mô hình.</w:t>
       </w:r>
     </w:p>
     <w:p>
       <w:pPr>
         <w:spacing w:line="312" w:lineRule="auto"/>
+        <w:ind w:firstLine="360"/>
+        <w:jc w:val="both"/>
         <w:rPr>
           <w:lang w:val="vi-VN"/>
         </w:rPr>
@@ -11183,7 +11550,11 @@
     </w:p>
     <w:p>
       <w:pPr>
-        <w:rPr>
+        <w:spacing w:line="312" w:lineRule="auto"/>
+        <w:ind w:firstLine="360"/>
+        <w:jc w:val="both"/>
+        <w:rPr>
+          <w:i/>
           <w:lang w:val="vi-VN"/>
         </w:rPr>
       </w:pPr>
@@ -11191,19 +11562,44 @@
         <w:rPr>
           <w:lang w:val="vi-VN"/>
         </w:rPr>
-        <w:t>Thử nghiệm với một câu ví dụ:</w:t>
-      </w:r>
-    </w:p>
-    <w:p>
-      <w:pPr>
-        <w:rPr>
+        <w:t>Kết quả thử nghiệm: BLEU trên tập Test = 0.</w:t>
+      </w:r>
+      <m:oMath>
+        <m:r>
+          <w:rPr>
+            <w:rFonts w:ascii="Cambria Math" w:hAnsi="Cambria Math"/>
+            <w:lang w:val="vi-VN"/>
+          </w:rPr>
+          <m:t>03</m:t>
+        </m:r>
+        <m:r>
+          <w:rPr>
+            <w:rFonts w:ascii="Cambria Math" w:hAnsi="Cambria Math"/>
+            <w:lang w:val="vi-VN"/>
+          </w:rPr>
+          <m:t>7</m:t>
+        </m:r>
+        <m:r>
+          <w:rPr>
+            <w:rFonts w:ascii="Cambria Math" w:hAnsi="Cambria Math"/>
+            <w:lang w:val="vi-VN"/>
+          </w:rPr>
+          <m:t>8</m:t>
+        </m:r>
+      </m:oMath>
+    </w:p>
+    <w:p>
+      <w:pPr>
+        <w:keepNext/>
+        <w:spacing w:line="312" w:lineRule="auto"/>
+        <w:jc w:val="center"/>
+      </w:pPr>
+      <w:r>
+        <w:rPr>
+          <w:noProof/>
           <w:lang w:val="vi-VN"/>
         </w:rPr>
-      </w:pPr>
-      <w:r>
-        <w:rPr>
-          <w:lang w:val="vi-VN"/>
-        </w:rPr>
+        <w:lastRenderedPageBreak/>
         <w:drawing>
           <wp:inline distT="0" distB="0" distL="0" distR="0" wp14:anchorId="0B84614D" wp14:editId="70958755">
             <wp:extent cx="5473700" cy="1028700"/>
@@ -11243,22 +11639,59 @@
     </w:p>
     <w:p>
       <w:pPr>
+        <w:pStyle w:val="Caption"/>
+        <w:jc w:val="center"/>
+      </w:pPr>
+      <w:r>
+        <w:t xml:space="preserve">Hình </w:t>
+      </w:r>
+      <w:fldSimple w:instr=" SEQ Hình \* ARABIC ">
+        <w:r>
+          <w:rPr>
+            <w:noProof/>
+          </w:rPr>
+          <w:t>17</w:t>
+        </w:r>
+      </w:fldSimple>
+      <w:r>
+        <w:t>. Thử nghiệm với 1 ví dụ trong tập test.</w:t>
+      </w:r>
+    </w:p>
+    <w:p>
+      <w:pPr>
+        <w:spacing w:line="312" w:lineRule="auto"/>
+      </w:pPr>
+    </w:p>
+    <w:p>
+      <w:pPr>
         <w:pStyle w:val="Heading2"/>
+        <w:numPr>
+          <w:ilvl w:val="1"/>
+          <w:numId w:val="48"/>
+        </w:numPr>
+        <w:spacing w:before="0" w:line="312" w:lineRule="auto"/>
+        <w:ind w:left="720"/>
         <w:rPr>
           <w:lang w:val="vi-VN"/>
         </w:rPr>
       </w:pPr>
+      <w:bookmarkStart w:id="22" w:name="_Toc228229125"/>
       <w:r>
         <w:rPr>
           <w:lang w:val="vi-VN"/>
         </w:rPr>
-        <w:lastRenderedPageBreak/>
-        <w:t>2. Kịch bản thử nghiệm 2</w:t>
+        <w:t xml:space="preserve">Kịch bản thử nghiệm </w:t>
+      </w:r>
+      <w:bookmarkEnd w:id="22"/>
+      <w:r>
+        <w:t>Transformer 1</w:t>
       </w:r>
     </w:p>
     <w:p>
       <w:pPr>
         <w:spacing w:line="312" w:lineRule="auto"/>
+        <w:ind w:firstLine="360"/>
+        <w:jc w:val="both"/>
         <w:rPr>
           <w:lang w:val="vi-VN"/>
         </w:rPr>
@@ -11267,180 +11700,150 @@
         <w:rPr>
           <w:lang w:val="vi-VN"/>
         </w:rPr>
-        <w:t>Sử dụng mô hình transoformer với các tham số như sau:</w:t>
+        <w:t xml:space="preserve">Mô hình Transformer trong kịch bản thử nghiệm thứ </w:t>
       </w:r>
       <w:r>
         <w:rPr>
           <w:lang w:val="vi-VN"/>
         </w:rPr>
+        <w:t>1</w:t>
+      </w:r>
+      <w:r>
+        <w:rPr>
+          <w:lang w:val="vi-VN"/>
+        </w:rPr>
+        <w:t xml:space="preserve"> được xây dựng với các tham số như sau:</w:t>
+      </w:r>
+    </w:p>
+    <w:p>
+      <w:pPr>
+        <w:pStyle w:val="ListParagraph"/>
+        <w:numPr>
+          <w:ilvl w:val="0"/>
+          <w:numId w:val="74"/>
+        </w:numPr>
+        <w:spacing w:line="312" w:lineRule="auto"/>
+        <w:ind w:left="900"/>
+        <w:jc w:val="both"/>
+        <w:rPr>
+          <w:lang w:val="vi-VN"/>
+        </w:rPr>
+      </w:pPr>
+      <w:r>
+        <w:rPr>
+          <w:lang w:val="vi-VN"/>
+        </w:rPr>
+        <w:t>Ngôn ngữ nguồn được xử lý bằng tokenizer en_core_web_sm, trong khi ngôn ngữ đích sử dụng vi_core_news_lg từ thư viện spaCy nhằm phục vụ quá trình tách từ và tiền xử lý văn bản.</w:t>
+      </w:r>
+    </w:p>
+    <w:p>
+      <w:pPr>
+        <w:pStyle w:val="ListParagraph"/>
+        <w:numPr>
+          <w:ilvl w:val="0"/>
+          <w:numId w:val="74"/>
+        </w:numPr>
+        <w:spacing w:line="312" w:lineRule="auto"/>
+        <w:ind w:left="900"/>
+        <w:jc w:val="both"/>
+        <w:rPr>
+          <w:lang w:val="vi-VN"/>
+        </w:rPr>
+      </w:pPr>
+      <w:r>
+        <w:rPr>
+          <w:lang w:val="vi-VN"/>
+        </w:rPr>
+        <w:t>Độ dài tối đa của câu được giới hạn ở 160 token, giúp kiểm soát chi phí tính toán và tránh các chuỗi quá dài trong quá trình huấn luyện. Dữ liệu được chia theo batch với kích thước 1500 token, và toàn bộ quá trình huấn luyện được thực hiện trên GPU (CUDA) để tăng tốc độ xử lý.</w:t>
+      </w:r>
+    </w:p>
+    <w:p>
+      <w:pPr>
+        <w:pStyle w:val="ListParagraph"/>
+        <w:numPr>
+          <w:ilvl w:val="0"/>
+          <w:numId w:val="74"/>
+        </w:numPr>
+        <w:spacing w:line="312" w:lineRule="auto"/>
+        <w:ind w:left="900"/>
+        <w:jc w:val="both"/>
+        <w:rPr>
+          <w:lang w:val="vi-VN"/>
+        </w:rPr>
+      </w:pPr>
+      <w:r>
+        <w:rPr>
+          <w:lang w:val="vi-VN"/>
+        </w:rPr>
+        <w:t>Về kiến trúc mô hình, Transformer sử dụng vector embedding với kích thước d_model = 512, gồm 6 lớp (layers) và 8 attention heads. Tỷ lệ dropout được thiết lập ở mức 0.1 nhằm giảm hiện tượng overfitting và cải thiện khả năng tổng quát hóa của mô hình.</w:t>
+      </w:r>
+    </w:p>
+    <w:p>
+      <w:pPr>
+        <w:pStyle w:val="ListParagraph"/>
+        <w:numPr>
+          <w:ilvl w:val="0"/>
+          <w:numId w:val="74"/>
+        </w:numPr>
+        <w:spacing w:line="312" w:lineRule="auto"/>
+        <w:ind w:left="900"/>
+        <w:jc w:val="both"/>
+        <w:rPr>
+          <w:lang w:val="vi-VN"/>
+        </w:rPr>
+      </w:pPr>
+      <w:r>
+        <w:rPr>
+          <w:lang w:val="vi-VN"/>
+        </w:rPr>
+        <w:t>Quá trình tối ưu sử dụng learning rate 0.0001 với tổng số 12 epochs huấn luyện. Trong giai đoạn suy luận, phương pháp beam search được áp dụng với beam size k = 5, giúp mô hình xem xét nhiều phương án đầu ra đồng thời và cải thiện chất lượng bản dịch.</w:t>
+      </w:r>
+    </w:p>
+    <w:p>
+      <w:pPr>
+        <w:spacing w:line="312" w:lineRule="auto"/>
+        <w:ind w:left="540"/>
+        <w:rPr>
+          <w:lang w:val="vi-VN"/>
+        </w:rPr>
+      </w:pPr>
+    </w:p>
+    <w:p>
+      <w:pPr>
+        <w:spacing w:line="312" w:lineRule="auto"/>
+        <w:ind w:firstLine="360"/>
+        <w:rPr>
+          <w:lang w:val="vi-VN"/>
+        </w:rPr>
+      </w:pPr>
+      <w:r>
+        <w:rPr>
+          <w:lang w:val="vi-VN"/>
+        </w:rPr>
+        <w:t>Kết quả thử nghiệm: BLEU trên tập Test = 0.</w:t>
+      </w:r>
+      <w:r>
+        <w:rPr>
+          <w:lang w:val="vi-VN"/>
+        </w:rPr>
+        <w:t>1128</w:t>
+      </w:r>
+    </w:p>
+    <w:p>
+      <w:pPr>
+        <w:keepNext/>
+        <w:spacing w:line="312" w:lineRule="auto"/>
+        <w:jc w:val="center"/>
+      </w:pPr>
+      <w:r>
+        <w:rPr>
+          <w:lang w:val="vi-VN"/>
+        </w:rPr>
         <w:br/>
       </w:r>
       <w:r>
         <w:rPr>
-          <w:lang w:val="vi-VN"/>
-        </w:rPr>
-        <w:t xml:space="preserve">Ngôn ngữ nguồn sử dụng tokenizer src_lang = en_core_web_sm, và ngôn ngữ đích sử dụng tokenizer trg_lang = vi_core_news_lg từ thư viện </w:t>
-      </w:r>
-      <w:r>
-        <w:rPr>
-          <w:lang w:val="vi-VN"/>
-        </w:rPr>
-        <w:t>s</w:t>
-      </w:r>
-      <w:r>
-        <w:rPr>
-          <w:lang w:val="vi-VN"/>
-        </w:rPr>
-        <w:t>paCy để thực hiện tách từ và tiền xử lý văn bản.</w:t>
-      </w:r>
-    </w:p>
-    <w:p>
-      <w:pPr>
-        <w:spacing w:line="312" w:lineRule="auto"/>
-        <w:rPr>
-          <w:lang w:val="vi-VN"/>
-        </w:rPr>
-      </w:pPr>
-      <w:r>
-        <w:rPr>
-          <w:lang w:val="vi-VN"/>
-        </w:rPr>
-        <w:t>Độ dài tối đa của câu được giới hạn ở max_strlen = 160 token nhằm kiểm soát chi phí tính toán và tránh các chuỗi quá dài.</w:t>
-      </w:r>
-    </w:p>
-    <w:p>
-      <w:pPr>
-        <w:spacing w:line="312" w:lineRule="auto"/>
-        <w:rPr>
-          <w:lang w:val="vi-VN"/>
-        </w:rPr>
-      </w:pPr>
-      <w:r>
-        <w:rPr>
-          <w:lang w:val="vi-VN"/>
-        </w:rPr>
-        <w:t>Kích thước batch được thiết lập là batchsize = 1500 (tính theo số token), và mô hình được huấn luyện trên thiết bị device = cuda để tận dụng GPU.</w:t>
-      </w:r>
-    </w:p>
-    <w:p>
-      <w:pPr>
-        <w:spacing w:line="312" w:lineRule="auto"/>
-        <w:rPr>
-          <w:lang w:val="vi-VN"/>
-        </w:rPr>
-      </w:pPr>
-      <w:r>
-        <w:rPr>
-          <w:lang w:val="vi-VN"/>
-        </w:rPr>
-        <w:t xml:space="preserve">Kích thước vector embedding d_model = 512, số lớp </w:t>
-      </w:r>
-      <w:r>
-        <w:rPr>
-          <w:color w:val="0070C0"/>
-          <w:lang w:val="vi-VN"/>
-        </w:rPr>
-        <w:t xml:space="preserve">Transformer n_layers = </w:t>
-      </w:r>
-      <w:r>
-        <w:rPr>
-          <w:color w:val="0070C0"/>
-          <w:lang w:val="vi-VN"/>
-        </w:rPr>
-        <w:t>6</w:t>
-      </w:r>
-      <w:r>
-        <w:rPr>
-          <w:lang w:val="vi-VN"/>
-        </w:rPr>
-        <w:t>, số lượng attention heads heads = 8, và tỷ lệ dropout dropout = 0.1 nhằm giảm overfitting và tăng khả năng tổng quát hóa.</w:t>
-      </w:r>
-    </w:p>
-    <w:p>
-      <w:pPr>
-        <w:spacing w:line="312" w:lineRule="auto"/>
-        <w:rPr>
-          <w:lang w:val="vi-VN"/>
-        </w:rPr>
-      </w:pPr>
-      <w:r>
-        <w:rPr>
-          <w:lang w:val="vi-VN"/>
-        </w:rPr>
-        <w:t xml:space="preserve">Tốc độ học được thiết lập là lr = 0.0001, số epoch huấn luyện epochs = </w:t>
-      </w:r>
-      <w:r>
-        <w:rPr>
-          <w:lang w:val="vi-VN"/>
-        </w:rPr>
-        <w:t>12</w:t>
-      </w:r>
-    </w:p>
-    <w:p>
-      <w:pPr>
-        <w:spacing w:line="312" w:lineRule="auto"/>
-        <w:rPr>
-          <w:lang w:val="vi-VN"/>
-        </w:rPr>
-      </w:pPr>
-      <w:r>
-        <w:rPr>
-          <w:lang w:val="vi-VN"/>
-        </w:rPr>
-        <w:t>Trong giai đoạn suy luận, beam search được sử dụng với kích thước beam k = 5 để cải thiện chất lượng bản dịch bằng cách xét nhiều khả năng đầu ra cùng lúc.</w:t>
-      </w:r>
-    </w:p>
-    <w:p>
-      <w:pPr>
-        <w:spacing w:line="312" w:lineRule="auto"/>
-        <w:rPr>
-          <w:lang w:val="vi-VN"/>
-        </w:rPr>
-      </w:pPr>
-    </w:p>
-    <w:p>
-      <w:pPr>
-        <w:spacing w:line="312" w:lineRule="auto"/>
-        <w:rPr>
-          <w:lang w:val="vi-VN"/>
-        </w:rPr>
-      </w:pPr>
-      <w:r>
-        <w:rPr>
-          <w:lang w:val="vi-VN"/>
-        </w:rPr>
-        <w:t>Kết quả thử nghiệm: BLEU trên tập Test = 0.1128</w:t>
-      </w:r>
-    </w:p>
-    <w:p>
-      <w:pPr>
-        <w:spacing w:line="312" w:lineRule="auto"/>
-        <w:rPr>
-          <w:lang w:val="vi-VN"/>
-        </w:rPr>
-      </w:pPr>
-    </w:p>
-    <w:p>
-      <w:pPr>
-        <w:spacing w:line="312" w:lineRule="auto"/>
-        <w:rPr>
-          <w:lang w:val="vi-VN"/>
-        </w:rPr>
-      </w:pPr>
-      <w:r>
-        <w:rPr>
-          <w:lang w:val="vi-VN"/>
-        </w:rPr>
-        <w:t>Thử nghiệm với một câu ví dụ:</w:t>
-      </w:r>
-      <w:r>
-        <w:rPr>
-          <w:lang w:val="vi-VN"/>
-        </w:rPr>
-        <w:br/>
-      </w:r>
-      <w:r>
-        <w:rPr>
+          <w:noProof/>
           <w:lang w:val="vi-VN"/>
         </w:rPr>
         <w:drawing>
@@ -11482,6 +11885,29 @@
     </w:p>
     <w:p>
       <w:pPr>
+        <w:pStyle w:val="Caption"/>
+        <w:jc w:val="center"/>
+        <w:rPr>
+          <w:lang w:val="vi-VN"/>
+        </w:rPr>
+      </w:pPr>
+      <w:r>
+        <w:t xml:space="preserve">Hình </w:t>
+      </w:r>
+      <w:fldSimple w:instr=" SEQ Hình \* ARABIC ">
+        <w:r>
+          <w:rPr>
+            <w:noProof/>
+          </w:rPr>
+          <w:t>18</w:t>
+        </w:r>
+      </w:fldSimple>
+      <w:r>
+        <w:t>. Thử nghiệm với 1 ví dụ trong tập test.</w:t>
+      </w:r>
+    </w:p>
+    <w:p>
+      <w:pPr>
         <w:spacing w:line="312" w:lineRule="auto"/>
         <w:rPr>
           <w:lang w:val="vi-VN"/>
@@ -11490,33 +11916,17 @@
     </w:p>
     <w:p>
       <w:pPr>
+        <w:keepNext/>
         <w:spacing w:line="312" w:lineRule="auto"/>
-        <w:rPr>
+      </w:pPr>
+      <w:r>
+        <w:rPr>
+          <w:noProof/>
+          <w:sz w:val="26"/>
+          <w:szCs w:val="26"/>
           <w:lang w:val="vi-VN"/>
         </w:rPr>
-      </w:pPr>
-      <w:r>
-        <w:rPr>
-          <w:lang w:val="vi-VN"/>
-        </w:rPr>
-        <w:t>Visualize Attention Map cho khối Decoder</w:t>
-      </w:r>
-    </w:p>
-    <w:p>
-      <w:pPr>
-        <w:spacing w:line="312" w:lineRule="auto"/>
-        <w:rPr>
-          <w:sz w:val="26"/>
-          <w:szCs w:val="26"/>
-          <w:lang w:val="vi-VN"/>
-        </w:rPr>
-      </w:pPr>
-      <w:r>
-        <w:rPr>
-          <w:sz w:val="26"/>
-          <w:szCs w:val="26"/>
-          <w:lang w:val="vi-VN"/>
-        </w:rPr>
+        <w:lastRenderedPageBreak/>
         <w:drawing>
           <wp:inline distT="0" distB="0" distL="0" distR="0" wp14:anchorId="133E4E8A" wp14:editId="10D7941A">
             <wp:extent cx="5727700" cy="1484630"/>
@@ -11556,6 +11966,37 @@
     </w:p>
     <w:p>
       <w:pPr>
+        <w:pStyle w:val="Caption"/>
+        <w:jc w:val="center"/>
+        <w:rPr>
+          <w:sz w:val="26"/>
+          <w:szCs w:val="26"/>
+          <w:lang w:val="vi-VN"/>
+        </w:rPr>
+      </w:pPr>
+      <w:r>
+        <w:t xml:space="preserve">Hình </w:t>
+      </w:r>
+      <w:fldSimple w:instr=" SEQ Hình \* ARABIC ">
+        <w:r>
+          <w:rPr>
+            <w:noProof/>
+          </w:rPr>
+          <w:t>19</w:t>
+        </w:r>
+      </w:fldSimple>
+      <w:r>
+        <w:t xml:space="preserve">. </w:t>
+      </w:r>
+      <w:r>
+        <w:t>Visualize Attention Map cho khối Decoder</w:t>
+      </w:r>
+      <w:r>
+        <w:t>.</w:t>
+      </w:r>
+    </w:p>
+    <w:p>
+      <w:pPr>
         <w:spacing w:line="312" w:lineRule="auto"/>
         <w:rPr>
           <w:sz w:val="26"/>
@@ -11567,39 +12008,60 @@
     <w:p>
       <w:pPr>
         <w:pStyle w:val="Heading2"/>
+        <w:numPr>
+          <w:ilvl w:val="1"/>
+          <w:numId w:val="48"/>
+        </w:numPr>
+        <w:spacing w:before="0" w:line="312" w:lineRule="auto"/>
+        <w:ind w:left="720"/>
         <w:rPr>
           <w:lang w:val="vi-VN"/>
         </w:rPr>
       </w:pPr>
+      <w:bookmarkStart w:id="23" w:name="_Toc228229126"/>
       <w:r>
         <w:rPr>
           <w:lang w:val="vi-VN"/>
         </w:rPr>
-        <w:t>3</w:t>
-      </w:r>
-      <w:r>
-        <w:t xml:space="preserve">. Kịch bản thử nghiệm </w:t>
-      </w:r>
+        <w:t xml:space="preserve">Kịch bản thử nghiệm </w:t>
+      </w:r>
+      <w:bookmarkEnd w:id="23"/>
       <w:r>
         <w:rPr>
           <w:lang w:val="vi-VN"/>
         </w:rPr>
-        <w:t>3</w:t>
+        <w:t>Transform</w:t>
+      </w:r>
+      <w:r>
+        <w:t>er 2</w:t>
       </w:r>
     </w:p>
     <w:p>
       <w:pPr>
         <w:spacing w:line="312" w:lineRule="auto"/>
-        <w:rPr>
-          <w:sz w:val="26"/>
-          <w:szCs w:val="26"/>
+        <w:ind w:firstLine="360"/>
+        <w:jc w:val="both"/>
+        <w:rPr>
           <w:lang w:val="vi-VN"/>
         </w:rPr>
       </w:pPr>
-    </w:p>
-    <w:p>
-      <w:pPr>
+      <w:r>
+        <w:rPr>
+          <w:lang w:val="vi-VN"/>
+        </w:rPr>
+        <w:t>Sử dụng mô hình transformer với các tham số như sau:</w:t>
+      </w:r>
+    </w:p>
+    <w:p>
+      <w:pPr>
+        <w:pStyle w:val="ListParagraph"/>
+        <w:numPr>
+          <w:ilvl w:val="0"/>
+          <w:numId w:val="75"/>
+        </w:numPr>
         <w:spacing w:line="312" w:lineRule="auto"/>
+        <w:ind w:left="900"/>
+        <w:jc w:val="both"/>
         <w:rPr>
           <w:lang w:val="vi-VN"/>
         </w:rPr>
@@ -11608,26 +12070,40 @@
         <w:rPr>
           <w:lang w:val="vi-VN"/>
         </w:rPr>
-        <w:t>Sử dụng mô hình transoformer với các tham số như sau:</w:t>
-      </w:r>
-      <w:r>
+        <w:t>Ngôn ngữ nguồn được xử lý bằng tokenizer en_core_web_sm, trong khi ngôn ngữ đích sử dụng tokenizer vi_core_news_lg từ thư viện spaCy nhằm thực hiện tách từ và tiền xử lý văn bản.</w:t>
+      </w:r>
+    </w:p>
+    <w:p>
+      <w:pPr>
+        <w:pStyle w:val="ListParagraph"/>
+        <w:numPr>
+          <w:ilvl w:val="0"/>
+          <w:numId w:val="75"/>
+        </w:numPr>
+        <w:spacing w:line="312" w:lineRule="auto"/>
+        <w:ind w:left="900"/>
+        <w:jc w:val="both"/>
         <w:rPr>
           <w:lang w:val="vi-VN"/>
         </w:rPr>
-        <w:br/>
-        <w:t xml:space="preserve">Ngôn ngữ nguồn sử dụng tokenizer src_lang = en_core_web_sm, và ngôn ngữ đích sử dụng </w:t>
-      </w:r>
+      </w:pPr>
       <w:r>
         <w:rPr>
           <w:lang w:val="vi-VN"/>
         </w:rPr>
-        <w:lastRenderedPageBreak/>
-        <w:t>tokenizer trg_lang = vi_core_news_lg từ thư viện spaCy để thực hiện tách từ và tiền xử lý văn bản.</w:t>
-      </w:r>
-    </w:p>
-    <w:p>
-      <w:pPr>
+        <w:t>Độ dài tối đa của câu được giới hạn ở 160 token, nhằm kiểm soát chi phí tính toán và tránh xử lý các chuỗi quá dài. Dữ liệu được chia theo batch với kích thước 1500 token, và toàn bộ quá trình huấn luyện được thực hiện trên GPU (CUDA) để tăng tốc độ xử lý.</w:t>
+      </w:r>
+    </w:p>
+    <w:p>
+      <w:pPr>
+        <w:pStyle w:val="ListParagraph"/>
+        <w:numPr>
+          <w:ilvl w:val="0"/>
+          <w:numId w:val="75"/>
+        </w:numPr>
         <w:spacing w:line="312" w:lineRule="auto"/>
+        <w:ind w:left="900"/>
+        <w:jc w:val="both"/>
         <w:rPr>
           <w:lang w:val="vi-VN"/>
         </w:rPr>
@@ -11636,12 +12112,19 @@
         <w:rPr>
           <w:lang w:val="vi-VN"/>
         </w:rPr>
-        <w:t>Độ dài tối đa của câu được giới hạn ở max_strlen = 160 token nhằm kiểm soát chi phí tính toán và tránh các chuỗi quá dài.</w:t>
-      </w:r>
-    </w:p>
-    <w:p>
-      <w:pPr>
+        <w:t>Về kiến trúc mô hình, Transformer sử dụng vector embedding với kích thước d_model = 512, gồm 8 lớp Encoder–Decoder (n_layers = 8) và 8 attention heads. Tỷ lệ dropout được thiết lập là 0.1 nhằm giảm hiện tượng overfitting và tăng khả năng tổng quát hóa của mô hình.</w:t>
+      </w:r>
+    </w:p>
+    <w:p>
+      <w:pPr>
+        <w:pStyle w:val="ListParagraph"/>
+        <w:numPr>
+          <w:ilvl w:val="0"/>
+          <w:numId w:val="75"/>
+        </w:numPr>
         <w:spacing w:line="312" w:lineRule="auto"/>
+        <w:ind w:left="900"/>
+        <w:jc w:val="both"/>
         <w:rPr>
           <w:lang w:val="vi-VN"/>
         </w:rPr>
@@ -11650,62 +12133,7 @@
         <w:rPr>
           <w:lang w:val="vi-VN"/>
         </w:rPr>
-        <w:t>Kích thước batch được thiết lập là batchsize = 1500 (tính theo số token), và mô hình được huấn luyện trên thiết bị device = cuda để tận dụng GPU.</w:t>
-      </w:r>
-    </w:p>
-    <w:p>
-      <w:pPr>
-        <w:spacing w:line="312" w:lineRule="auto"/>
-        <w:rPr>
-          <w:lang w:val="vi-VN"/>
-        </w:rPr>
-      </w:pPr>
-      <w:r>
-        <w:rPr>
-          <w:lang w:val="vi-VN"/>
-        </w:rPr>
-        <w:t xml:space="preserve">Kích thước vector embedding d_model = 512, số lớp </w:t>
-      </w:r>
-      <w:r>
-        <w:rPr>
-          <w:color w:val="0070C0"/>
-          <w:lang w:val="vi-VN"/>
-        </w:rPr>
-        <w:t>Transformer n_layers = 8</w:t>
-      </w:r>
-      <w:r>
-        <w:rPr>
-          <w:lang w:val="vi-VN"/>
-        </w:rPr>
-        <w:t>, số lượng attention heads heads = 8, và tỷ lệ dropout dropout = 0.1 nhằm giảm overfitting và tăng khả năng tổng quát hóa.</w:t>
-      </w:r>
-    </w:p>
-    <w:p>
-      <w:pPr>
-        <w:spacing w:line="312" w:lineRule="auto"/>
-        <w:rPr>
-          <w:lang w:val="vi-VN"/>
-        </w:rPr>
-      </w:pPr>
-      <w:r>
-        <w:rPr>
-          <w:lang w:val="vi-VN"/>
-        </w:rPr>
-        <w:t>Tốc độ học được thiết lập là lr = 0.0001, số epoch huấn luyện epochs = 12</w:t>
-      </w:r>
-    </w:p>
-    <w:p>
-      <w:pPr>
-        <w:spacing w:line="312" w:lineRule="auto"/>
-        <w:rPr>
-          <w:lang w:val="vi-VN"/>
-        </w:rPr>
-      </w:pPr>
-      <w:r>
-        <w:rPr>
-          <w:lang w:val="vi-VN"/>
-        </w:rPr>
-        <w:t>Trong giai đoạn suy luận, beam search được sử dụng với kích thước beam k = 5 để cải thiện chất lượng bản dịch bằng cách xét nhiều khả năng đầu ra cùng lúc.</w:t>
+        <w:t>Quá trình huấn luyện sử dụng learning rate 0.0001 với tổng số 12 epochs. Trong giai đoạn suy luận, phương pháp beam search được áp dụng với beam size k = 5, giúp mô hình xem xét nhiều phương án đầu ra và cải thiện chất lượng bản dịch.</w:t>
       </w:r>
     </w:p>
     <w:p>
@@ -11720,6 +12148,7 @@
     <w:p>
       <w:pPr>
         <w:spacing w:line="312" w:lineRule="auto"/>
+        <w:ind w:firstLine="360"/>
         <w:rPr>
           <w:lang w:val="vi-VN"/>
         </w:rPr>
@@ -11731,6 +12160,9 @@
         <w:t xml:space="preserve">Kết quả thử nghiệm: BLEU trên tập Test = </w:t>
       </w:r>
       <w:r>
+        <w:rPr>
+          <w:lang w:val="vi-VN"/>
+        </w:rPr>
         <w:t>0.1092</w:t>
       </w:r>
     </w:p>
@@ -11741,8 +12173,16 @@
           <w:lang w:val="vi-VN"/>
         </w:rPr>
       </w:pPr>
-      <w:r>
-        <w:rPr>
+    </w:p>
+    <w:p>
+      <w:pPr>
+        <w:keepNext/>
+        <w:spacing w:line="312" w:lineRule="auto"/>
+        <w:jc w:val="center"/>
+      </w:pPr>
+      <w:r>
+        <w:rPr>
+          <w:noProof/>
           <w:lang w:val="vi-VN"/>
         </w:rPr>
         <w:drawing>
@@ -11784,41 +12224,38 @@
     </w:p>
     <w:p>
       <w:pPr>
+        <w:pStyle w:val="Caption"/>
+        <w:jc w:val="center"/>
+      </w:pPr>
+      <w:r>
+        <w:t xml:space="preserve">Hình </w:t>
+      </w:r>
+      <w:fldSimple w:instr=" SEQ Hình \* ARABIC ">
+        <w:r>
+          <w:rPr>
+            <w:noProof/>
+          </w:rPr>
+          <w:t>20</w:t>
+        </w:r>
+      </w:fldSimple>
+      <w:r>
+        <w:t>. Thực nghiệm với 1 ví dụ trong tập test.</w:t>
+      </w:r>
+    </w:p>
+    <w:p>
+      <w:pPr>
+        <w:keepNext/>
         <w:spacing w:line="312" w:lineRule="auto"/>
-        <w:rPr>
+        <w:jc w:val="center"/>
+      </w:pPr>
+      <w:r>
+        <w:rPr>
+          <w:noProof/>
+          <w:sz w:val="26"/>
+          <w:szCs w:val="26"/>
           <w:lang w:val="vi-VN"/>
         </w:rPr>
-      </w:pPr>
-    </w:p>
-    <w:p>
-      <w:pPr>
-        <w:spacing w:line="312" w:lineRule="auto"/>
-        <w:rPr>
-          <w:lang w:val="vi-VN"/>
-        </w:rPr>
-      </w:pPr>
-      <w:r>
-        <w:rPr>
-          <w:lang w:val="vi-VN"/>
-        </w:rPr>
-        <w:t>Thử nghiệm với một câu ví dụ:</w:t>
-      </w:r>
-    </w:p>
-    <w:p>
-      <w:pPr>
-        <w:spacing w:line="312" w:lineRule="auto"/>
-        <w:rPr>
-          <w:sz w:val="26"/>
-          <w:szCs w:val="26"/>
-          <w:lang w:val="vi-VN"/>
-        </w:rPr>
-      </w:pPr>
-      <w:r>
-        <w:rPr>
-          <w:sz w:val="26"/>
-          <w:szCs w:val="26"/>
-          <w:lang w:val="vi-VN"/>
-        </w:rPr>
+        <w:lastRenderedPageBreak/>
         <w:drawing>
           <wp:inline distT="0" distB="0" distL="0" distR="0" wp14:anchorId="7DDF1B8A" wp14:editId="2E7A6E62">
             <wp:extent cx="5727700" cy="1484630"/>
@@ -11855,6 +12292,29 @@
           </wp:inline>
         </w:drawing>
       </w:r>
+    </w:p>
+    <w:p>
+      <w:pPr>
+        <w:pStyle w:val="Caption"/>
+        <w:jc w:val="center"/>
+      </w:pPr>
+      <w:r>
+        <w:t xml:space="preserve">Hình </w:t>
+      </w:r>
+      <w:fldSimple w:instr=" SEQ Hình \* ARABIC ">
+        <w:r>
+          <w:rPr>
+            <w:noProof/>
+          </w:rPr>
+          <w:t>21</w:t>
+        </w:r>
+      </w:fldSimple>
+      <w:r>
+        <w:t xml:space="preserve">. </w:t>
+      </w:r>
+      <w:r>
+        <w:t>Visualize Attention Map cho khối Decoder.</w:t>
+      </w:r>
       <w:r>
         <w:rPr>
           <w:sz w:val="26"/>
@@ -11867,34 +12327,40 @@
     <w:p>
       <w:pPr>
         <w:pStyle w:val="Heading2"/>
+        <w:numPr>
+          <w:ilvl w:val="1"/>
+          <w:numId w:val="48"/>
+        </w:numPr>
+        <w:spacing w:before="0" w:line="312" w:lineRule="auto"/>
+        <w:ind w:left="720"/>
         <w:rPr>
           <w:lang w:val="vi-VN"/>
         </w:rPr>
       </w:pPr>
+      <w:bookmarkStart w:id="24" w:name="_Toc228229127"/>
       <w:r>
         <w:rPr>
           <w:lang w:val="vi-VN"/>
         </w:rPr>
-        <w:lastRenderedPageBreak/>
-        <w:t>4. Kết quả so sánh ba kịch bản:</w:t>
-      </w:r>
-    </w:p>
-    <w:p>
-      <w:pPr>
+        <w:t>Kết quả so sánh ba kịch bản:</w:t>
+      </w:r>
+      <w:bookmarkEnd w:id="24"/>
+    </w:p>
+    <w:p>
+      <w:pPr>
+        <w:keepNext/>
+        <w:spacing w:line="312" w:lineRule="auto"/>
         <w:jc w:val="center"/>
-        <w:rPr>
-          <w:lang w:val="vi-VN"/>
-        </w:rPr>
-      </w:pPr>
-      <w:r>
-        <w:rPr>
-          <w:lang w:val="vi-VN"/>
+      </w:pPr>
+      <w:r>
+        <w:rPr>
+          <w:noProof/>
         </w:rPr>
         <w:drawing>
-          <wp:inline distT="0" distB="0" distL="0" distR="0" wp14:anchorId="6063C8D8" wp14:editId="6F1CFE5A">
-            <wp:extent cx="3657600" cy="2882900"/>
+          <wp:inline distT="0" distB="0" distL="0" distR="0" wp14:anchorId="22E661B9" wp14:editId="5BB66FDA">
+            <wp:extent cx="3657600" cy="2863850"/>
             <wp:effectExtent l="0" t="0" r="0" b="0"/>
-            <wp:docPr id="1597216671" name="Picture 1"/>
+            <wp:docPr id="2024805438" name="Picture 1"/>
             <wp:cNvGraphicFramePr>
               <a:graphicFrameLocks xmlns:a="http://schemas.openxmlformats.org/drawingml/2006/main" noChangeAspect="1"/>
             </wp:cNvGraphicFramePr>
@@ -11902,23 +12368,36 @@
               <a:graphicData uri="http://schemas.openxmlformats.org/drawingml/2006/picture">
                 <pic:pic xmlns:pic="http://schemas.openxmlformats.org/drawingml/2006/picture">
                   <pic:nvPicPr>
-                    <pic:cNvPr id="1597216671" name=""/>
-                    <pic:cNvPicPr/>
+                    <pic:cNvPr id="0" name="Picture 1"/>
+                    <pic:cNvPicPr>
+                      <a:picLocks noChangeAspect="1" noChangeArrowheads="1"/>
+                    </pic:cNvPicPr>
                   </pic:nvPicPr>
                   <pic:blipFill>
-                    <a:blip r:embed="rId33"/>
+                    <a:blip r:embed="rId33">
+                      <a:extLst>
+                        <a:ext uri="{28A0092B-C50C-407E-A947-70E740481C1C}">
+                          <a14:useLocalDpi xmlns:a14="http://schemas.microsoft.com/office/drawing/2010/main" val="0"/>
+                        </a:ext>
+                      </a:extLst>
+                    </a:blip>
+                    <a:srcRect/>
                     <a:stretch>
                       <a:fillRect/>
                     </a:stretch>
                   </pic:blipFill>
-                  <pic:spPr>
+                  <pic:spPr bwMode="auto">
                     <a:xfrm>
                       <a:off x="0" y="0"/>
-                      <a:ext cx="3657600" cy="2882900"/>
+                      <a:ext cx="3657600" cy="2863850"/>
                     </a:xfrm>
                     <a:prstGeom prst="rect">
                       <a:avLst/>
                     </a:prstGeom>
+                    <a:noFill/>
+                    <a:ln>
+                      <a:noFill/>
+                    </a:ln>
                   </pic:spPr>
                 </pic:pic>
               </a:graphicData>
@@ -11927,6 +12406,27 @@
         </w:drawing>
       </w:r>
     </w:p>
+    <w:p>
+      <w:pPr>
+        <w:pStyle w:val="Caption"/>
+        <w:jc w:val="center"/>
+      </w:pPr>
+      <w:r>
+        <w:t xml:space="preserve">Hình </w:t>
+      </w:r>
+      <w:fldSimple w:instr=" SEQ Hình \* ARABIC ">
+        <w:r>
+          <w:rPr>
+            <w:noProof/>
+          </w:rPr>
+          <w:t>22</w:t>
+        </w:r>
+      </w:fldSimple>
+      <w:r>
+        <w:t>. So sánh các kịch bản thử nghiệm.</w:t>
+      </w:r>
+    </w:p>
+    <w:p/>
     <w:p>
       <w:pPr>
         <w:pStyle w:val="ListParagraph"/>
@@ -11945,7 +12445,7 @@
           <w:szCs w:val="28"/>
         </w:rPr>
       </w:pPr>
-      <w:bookmarkStart w:id="21" w:name="_Toc228217457"/>
+      <w:bookmarkStart w:id="25" w:name="_Toc228229128"/>
       <w:r>
         <w:rPr>
           <w:b/>
@@ -11955,14 +12455,13 @@
         </w:rPr>
         <w:t>Kết luận</w:t>
       </w:r>
-      <w:bookmarkEnd w:id="21"/>
+      <w:bookmarkEnd w:id="25"/>
     </w:p>
     <w:p>
       <w:pPr>
         <w:spacing w:line="312" w:lineRule="auto"/>
-        <w:ind w:left="180"/>
+        <w:ind w:firstLine="360"/>
         <w:jc w:val="both"/>
-        <w:outlineLvl w:val="0"/>
         <w:rPr>
           <w:lang w:val="vi-VN"/>
         </w:rPr>
@@ -11983,9 +12482,8 @@
     <w:p>
       <w:pPr>
         <w:spacing w:line="312" w:lineRule="auto"/>
-        <w:ind w:left="180"/>
+        <w:ind w:firstLine="360"/>
         <w:jc w:val="both"/>
-        <w:outlineLvl w:val="0"/>
         <w:rPr>
           <w:lang w:val="vi-VN"/>
         </w:rPr>
@@ -12022,7 +12520,7 @@
           <w:szCs w:val="28"/>
         </w:rPr>
       </w:pPr>
-      <w:bookmarkStart w:id="22" w:name="_Toc228217458"/>
+      <w:bookmarkStart w:id="26" w:name="_Toc228229129"/>
       <w:r>
         <w:rPr>
           <w:b/>
@@ -12032,12 +12530,13 @@
         </w:rPr>
         <w:t>Tài liệu tham khảo</w:t>
       </w:r>
-      <w:bookmarkEnd w:id="22"/>
+      <w:bookmarkEnd w:id="26"/>
     </w:p>
     <w:p>
       <w:pPr>
         <w:spacing w:line="312" w:lineRule="auto"/>
         <w:ind w:left="360" w:hanging="360"/>
+        <w:jc w:val="both"/>
         <w:rPr>
           <w:sz w:val="26"/>
           <w:szCs w:val="26"/>
@@ -12081,6 +12580,7 @@
       <w:pPr>
         <w:spacing w:line="312" w:lineRule="auto"/>
         <w:ind w:left="360" w:hanging="360"/>
+        <w:jc w:val="both"/>
         <w:rPr>
           <w:sz w:val="26"/>
           <w:szCs w:val="26"/>
@@ -12124,6 +12624,7 @@
       <w:pPr>
         <w:spacing w:line="312" w:lineRule="auto"/>
         <w:ind w:left="360" w:hanging="360"/>
+        <w:jc w:val="both"/>
         <w:rPr>
           <w:sz w:val="26"/>
           <w:szCs w:val="26"/>
@@ -12135,6 +12636,7 @@
           <w:szCs w:val="26"/>
           <w:lang w:val="vi-VN"/>
         </w:rPr>
+        <w:lastRenderedPageBreak/>
         <w:t>[3] J. Alammar, “Visualizing Neural Machine Translation Mechanics of Seq2Seq Models with Attention,” 2018.</w:t>
       </w:r>
       <w:r>
@@ -12168,6 +12670,7 @@
       <w:pPr>
         <w:spacing w:line="312" w:lineRule="auto"/>
         <w:ind w:left="360" w:hanging="360"/>
+        <w:jc w:val="both"/>
         <w:rPr>
           <w:sz w:val="26"/>
           <w:szCs w:val="26"/>
@@ -12212,6 +12715,7 @@
       <w:pPr>
         <w:spacing w:line="312" w:lineRule="auto"/>
         <w:ind w:left="360" w:hanging="360"/>
+        <w:jc w:val="both"/>
         <w:rPr>
           <w:sz w:val="26"/>
           <w:szCs w:val="26"/>
@@ -12255,6 +12759,7 @@
       <w:pPr>
         <w:spacing w:line="312" w:lineRule="auto"/>
         <w:ind w:left="360" w:hanging="360"/>
+        <w:jc w:val="both"/>
         <w:rPr>
           <w:sz w:val="26"/>
           <w:szCs w:val="26"/>
@@ -12299,6 +12804,7 @@
       <w:pPr>
         <w:spacing w:line="312" w:lineRule="auto"/>
         <w:ind w:left="360" w:hanging="360"/>
+        <w:jc w:val="both"/>
         <w:rPr>
           <w:sz w:val="26"/>
           <w:szCs w:val="26"/>
@@ -12311,7 +12817,6 @@
           <w:szCs w:val="26"/>
           <w:lang w:val="vi-VN"/>
         </w:rPr>
-        <w:lastRenderedPageBreak/>
         <w:t>[7] Stefan-it, “Neural Machine Translation English–Vietnamese,” GitHub repository.</w:t>
       </w:r>
       <w:r>
@@ -12581,7 +13086,7 @@
   <w:abstractNum w:abstractNumId="1" w15:restartNumberingAfterBreak="0">
     <w:nsid w:val="03BB5E66"/>
     <w:multiLevelType w:val="hybridMultilevel"/>
-    <w:tmpl w:val="59AA20AC"/>
+    <w:tmpl w:val="4AD2B62A"/>
     <w:lvl w:ilvl="0" w:tplc="04090013">
       <w:start w:val="1"/>
       <w:numFmt w:val="upperRoman"/>
@@ -12591,14 +13096,17 @@
         <w:ind w:left="720" w:hanging="360"/>
       </w:pPr>
     </w:lvl>
-    <w:lvl w:ilvl="1" w:tplc="04090019" w:tentative="1">
-      <w:start w:val="1"/>
-      <w:numFmt w:val="lowerLetter"/>
+    <w:lvl w:ilvl="1" w:tplc="3F46E5DE">
+      <w:start w:val="1"/>
+      <w:numFmt w:val="decimal"/>
       <w:lvlText w:val="%2."/>
       <w:lvlJc w:val="left"/>
       <w:pPr>
         <w:ind w:left="1440" w:hanging="360"/>
       </w:pPr>
+      <w:rPr>
+        <w:rFonts w:hint="default"/>
+      </w:rPr>
     </w:lvl>
     <w:lvl w:ilvl="2" w:tplc="0409001B" w:tentative="1">
       <w:start w:val="1"/>
@@ -14844,6 +15352,119 @@
     </w:lvl>
   </w:abstractNum>
   <w:abstractNum w:abstractNumId="18" w15:restartNumberingAfterBreak="0">
+    <w:nsid w:val="201D2B8E"/>
+    <w:multiLevelType w:val="hybridMultilevel"/>
+    <w:tmpl w:val="3494A1BA"/>
+    <w:lvl w:ilvl="0" w:tplc="04090001">
+      <w:start w:val="1"/>
+      <w:numFmt w:val="bullet"/>
+      <w:lvlText w:val=""/>
+      <w:lvlJc w:val="left"/>
+      <w:pPr>
+        <w:ind w:left="1080" w:hanging="360"/>
+      </w:pPr>
+      <w:rPr>
+        <w:rFonts w:ascii="Symbol" w:hAnsi="Symbol" w:hint="default"/>
+      </w:rPr>
+    </w:lvl>
+    <w:lvl w:ilvl="1" w:tplc="04090003" w:tentative="1">
+      <w:start w:val="1"/>
+      <w:numFmt w:val="bullet"/>
+      <w:lvlText w:val="o"/>
+      <w:lvlJc w:val="left"/>
+      <w:pPr>
+        <w:ind w:left="1800" w:hanging="360"/>
+      </w:pPr>
+      <w:rPr>
+        <w:rFonts w:ascii="Courier New" w:hAnsi="Courier New" w:cs="Courier New" w:hint="default"/>
+      </w:rPr>
+    </w:lvl>
+    <w:lvl w:ilvl="2" w:tplc="04090005" w:tentative="1">
+      <w:start w:val="1"/>
+      <w:numFmt w:val="bullet"/>
+      <w:lvlText w:val=""/>
+      <w:lvlJc w:val="left"/>
+      <w:pPr>
+        <w:ind w:left="2520" w:hanging="360"/>
+      </w:pPr>
+      <w:rPr>
+        <w:rFonts w:ascii="Wingdings" w:hAnsi="Wingdings" w:hint="default"/>
+      </w:rPr>
+    </w:lvl>
+    <w:lvl w:ilvl="3" w:tplc="04090001" w:tentative="1">
+      <w:start w:val="1"/>
+      <w:numFmt w:val="bullet"/>
+      <w:lvlText w:val=""/>
+      <w:lvlJc w:val="left"/>
+      <w:pPr>
+        <w:ind w:left="3240" w:hanging="360"/>
+      </w:pPr>
+      <w:rPr>
+        <w:rFonts w:ascii="Symbol" w:hAnsi="Symbol" w:hint="default"/>
+      </w:rPr>
+    </w:lvl>
+    <w:lvl w:ilvl="4" w:tplc="04090003" w:tentative="1">
+      <w:start w:val="1"/>
+      <w:numFmt w:val="bullet"/>
+      <w:lvlText w:val="o"/>
+      <w:lvlJc w:val="left"/>
+      <w:pPr>
+        <w:ind w:left="3960" w:hanging="360"/>
+      </w:pPr>
+      <w:rPr>
+        <w:rFonts w:ascii="Courier New" w:hAnsi="Courier New" w:cs="Courier New" w:hint="default"/>
+      </w:rPr>
+    </w:lvl>
+    <w:lvl w:ilvl="5" w:tplc="04090005" w:tentative="1">
+      <w:start w:val="1"/>
+      <w:numFmt w:val="bullet"/>
+      <w:lvlText w:val=""/>
+      <w:lvlJc w:val="left"/>
+      <w:pPr>
+        <w:ind w:left="4680" w:hanging="360"/>
+      </w:pPr>
+      <w:rPr>
+        <w:rFonts w:ascii="Wingdings" w:hAnsi="Wingdings" w:hint="default"/>
+      </w:rPr>
+    </w:lvl>
+    <w:lvl w:ilvl="6" w:tplc="04090001" w:tentative="1">
+      <w:start w:val="1"/>
+      <w:numFmt w:val="bullet"/>
+      <w:lvlText w:val=""/>
+      <w:lvlJc w:val="left"/>
+      <w:pPr>
+        <w:ind w:left="5400" w:hanging="360"/>
+      </w:pPr>
+      <w:rPr>
+        <w:rFonts w:ascii="Symbol" w:hAnsi="Symbol" w:hint="default"/>
+      </w:rPr>
+    </w:lvl>
+    <w:lvl w:ilvl="7" w:tplc="04090003" w:tentative="1">
+      <w:start w:val="1"/>
+      <w:numFmt w:val="bullet"/>
+      <w:lvlText w:val="o"/>
+      <w:lvlJc w:val="left"/>
+      <w:pPr>
+        <w:ind w:left="6120" w:hanging="360"/>
+      </w:pPr>
+      <w:rPr>
+        <w:rFonts w:ascii="Courier New" w:hAnsi="Courier New" w:cs="Courier New" w:hint="default"/>
+      </w:rPr>
+    </w:lvl>
+    <w:lvl w:ilvl="8" w:tplc="04090005" w:tentative="1">
+      <w:start w:val="1"/>
+      <w:numFmt w:val="bullet"/>
+      <w:lvlText w:val=""/>
+      <w:lvlJc w:val="left"/>
+      <w:pPr>
+        <w:ind w:left="6840" w:hanging="360"/>
+      </w:pPr>
+      <w:rPr>
+        <w:rFonts w:ascii="Wingdings" w:hAnsi="Wingdings" w:hint="default"/>
+      </w:rPr>
+    </w:lvl>
+  </w:abstractNum>
+  <w:abstractNum w:abstractNumId="19" w15:restartNumberingAfterBreak="0">
     <w:nsid w:val="215F00FF"/>
     <w:multiLevelType w:val="multilevel"/>
     <w:tmpl w:val="E408C04E"/>
@@ -14992,7 +15613,7 @@
       </w:rPr>
     </w:lvl>
   </w:abstractNum>
-  <w:abstractNum w:abstractNumId="19" w15:restartNumberingAfterBreak="0">
+  <w:abstractNum w:abstractNumId="20" w15:restartNumberingAfterBreak="0">
     <w:nsid w:val="26E609A0"/>
     <w:multiLevelType w:val="multilevel"/>
     <w:tmpl w:val="C8A64314"/>
@@ -15141,7 +15762,7 @@
       </w:rPr>
     </w:lvl>
   </w:abstractNum>
-  <w:abstractNum w:abstractNumId="20" w15:restartNumberingAfterBreak="0">
+  <w:abstractNum w:abstractNumId="21" w15:restartNumberingAfterBreak="0">
     <w:nsid w:val="29640FFF"/>
     <w:multiLevelType w:val="hybridMultilevel"/>
     <w:tmpl w:val="B818F2A4"/>
@@ -15254,7 +15875,7 @@
       </w:rPr>
     </w:lvl>
   </w:abstractNum>
-  <w:abstractNum w:abstractNumId="21" w15:restartNumberingAfterBreak="0">
+  <w:abstractNum w:abstractNumId="22" w15:restartNumberingAfterBreak="0">
     <w:nsid w:val="2B72725C"/>
     <w:multiLevelType w:val="multilevel"/>
     <w:tmpl w:val="ED184D7C"/>
@@ -15403,7 +16024,7 @@
       </w:rPr>
     </w:lvl>
   </w:abstractNum>
-  <w:abstractNum w:abstractNumId="22" w15:restartNumberingAfterBreak="0">
+  <w:abstractNum w:abstractNumId="23" w15:restartNumberingAfterBreak="0">
     <w:nsid w:val="2D234521"/>
     <w:multiLevelType w:val="hybridMultilevel"/>
     <w:tmpl w:val="8402D416"/>
@@ -15516,7 +16137,7 @@
       </w:rPr>
     </w:lvl>
   </w:abstractNum>
-  <w:abstractNum w:abstractNumId="23" w15:restartNumberingAfterBreak="0">
+  <w:abstractNum w:abstractNumId="24" w15:restartNumberingAfterBreak="0">
     <w:nsid w:val="2D8F06DD"/>
     <w:multiLevelType w:val="hybridMultilevel"/>
     <w:tmpl w:val="1BFE3B64"/>
@@ -15629,7 +16250,7 @@
       </w:rPr>
     </w:lvl>
   </w:abstractNum>
-  <w:abstractNum w:abstractNumId="24" w15:restartNumberingAfterBreak="0">
+  <w:abstractNum w:abstractNumId="25" w15:restartNumberingAfterBreak="0">
     <w:nsid w:val="2F1A330C"/>
     <w:multiLevelType w:val="hybridMultilevel"/>
     <w:tmpl w:val="3190B1AC"/>
@@ -15742,7 +16363,7 @@
       </w:rPr>
     </w:lvl>
   </w:abstractNum>
-  <w:abstractNum w:abstractNumId="25" w15:restartNumberingAfterBreak="0">
+  <w:abstractNum w:abstractNumId="26" w15:restartNumberingAfterBreak="0">
     <w:nsid w:val="30BF5C5A"/>
     <w:multiLevelType w:val="multilevel"/>
     <w:tmpl w:val="7A34BDAC"/>
@@ -15858,7 +16479,7 @@
       </w:pPr>
     </w:lvl>
   </w:abstractNum>
-  <w:abstractNum w:abstractNumId="26" w15:restartNumberingAfterBreak="0">
+  <w:abstractNum w:abstractNumId="27" w15:restartNumberingAfterBreak="0">
     <w:nsid w:val="32563B1D"/>
     <w:multiLevelType w:val="multilevel"/>
     <w:tmpl w:val="0344A3D2"/>
@@ -16007,7 +16628,7 @@
       </w:rPr>
     </w:lvl>
   </w:abstractNum>
-  <w:abstractNum w:abstractNumId="27" w15:restartNumberingAfterBreak="0">
+  <w:abstractNum w:abstractNumId="28" w15:restartNumberingAfterBreak="0">
     <w:nsid w:val="32594CBF"/>
     <w:multiLevelType w:val="multilevel"/>
     <w:tmpl w:val="FA682B1A"/>
@@ -16156,7 +16777,7 @@
       </w:rPr>
     </w:lvl>
   </w:abstractNum>
-  <w:abstractNum w:abstractNumId="28" w15:restartNumberingAfterBreak="0">
+  <w:abstractNum w:abstractNumId="29" w15:restartNumberingAfterBreak="0">
     <w:nsid w:val="32C3280D"/>
     <w:multiLevelType w:val="multilevel"/>
     <w:tmpl w:val="6F84BDB4"/>
@@ -16305,7 +16926,7 @@
       </w:rPr>
     </w:lvl>
   </w:abstractNum>
-  <w:abstractNum w:abstractNumId="29" w15:restartNumberingAfterBreak="0">
+  <w:abstractNum w:abstractNumId="30" w15:restartNumberingAfterBreak="0">
     <w:nsid w:val="35B75B75"/>
     <w:multiLevelType w:val="multilevel"/>
     <w:tmpl w:val="DDFCA804"/>
@@ -16454,7 +17075,7 @@
       </w:rPr>
     </w:lvl>
   </w:abstractNum>
-  <w:abstractNum w:abstractNumId="30" w15:restartNumberingAfterBreak="0">
+  <w:abstractNum w:abstractNumId="31" w15:restartNumberingAfterBreak="0">
     <w:nsid w:val="35F47E6A"/>
     <w:multiLevelType w:val="multilevel"/>
     <w:tmpl w:val="04F69FB8"/>
@@ -16603,7 +17224,7 @@
       </w:rPr>
     </w:lvl>
   </w:abstractNum>
-  <w:abstractNum w:abstractNumId="31" w15:restartNumberingAfterBreak="0">
+  <w:abstractNum w:abstractNumId="32" w15:restartNumberingAfterBreak="0">
     <w:nsid w:val="368A7CCA"/>
     <w:multiLevelType w:val="multilevel"/>
     <w:tmpl w:val="45EA9F6C"/>
@@ -16752,7 +17373,7 @@
       </w:rPr>
     </w:lvl>
   </w:abstractNum>
-  <w:abstractNum w:abstractNumId="32" w15:restartNumberingAfterBreak="0">
+  <w:abstractNum w:abstractNumId="33" w15:restartNumberingAfterBreak="0">
     <w:nsid w:val="36C13609"/>
     <w:multiLevelType w:val="multilevel"/>
     <w:tmpl w:val="F5FC4D7A"/>
@@ -16868,7 +17489,7 @@
       </w:pPr>
     </w:lvl>
   </w:abstractNum>
-  <w:abstractNum w:abstractNumId="33" w15:restartNumberingAfterBreak="0">
+  <w:abstractNum w:abstractNumId="34" w15:restartNumberingAfterBreak="0">
     <w:nsid w:val="36E06BFC"/>
     <w:multiLevelType w:val="multilevel"/>
     <w:tmpl w:val="BF246C28"/>
@@ -17017,7 +17638,7 @@
       </w:rPr>
     </w:lvl>
   </w:abstractNum>
-  <w:abstractNum w:abstractNumId="34" w15:restartNumberingAfterBreak="0">
+  <w:abstractNum w:abstractNumId="35" w15:restartNumberingAfterBreak="0">
     <w:nsid w:val="37EF1425"/>
     <w:multiLevelType w:val="multilevel"/>
     <w:tmpl w:val="E1EA6E88"/>
@@ -17166,7 +17787,7 @@
       </w:rPr>
     </w:lvl>
   </w:abstractNum>
-  <w:abstractNum w:abstractNumId="35" w15:restartNumberingAfterBreak="0">
+  <w:abstractNum w:abstractNumId="36" w15:restartNumberingAfterBreak="0">
     <w:nsid w:val="39471E9D"/>
     <w:multiLevelType w:val="multilevel"/>
     <w:tmpl w:val="69265E7E"/>
@@ -17279,7 +17900,7 @@
       </w:pPr>
     </w:lvl>
   </w:abstractNum>
-  <w:abstractNum w:abstractNumId="36" w15:restartNumberingAfterBreak="0">
+  <w:abstractNum w:abstractNumId="37" w15:restartNumberingAfterBreak="0">
     <w:nsid w:val="3A2B542C"/>
     <w:multiLevelType w:val="hybridMultilevel"/>
     <w:tmpl w:val="B622C382"/>
@@ -17392,7 +18013,7 @@
       </w:rPr>
     </w:lvl>
   </w:abstractNum>
-  <w:abstractNum w:abstractNumId="37" w15:restartNumberingAfterBreak="0">
+  <w:abstractNum w:abstractNumId="38" w15:restartNumberingAfterBreak="0">
     <w:nsid w:val="3E533834"/>
     <w:multiLevelType w:val="hybridMultilevel"/>
     <w:tmpl w:val="CCBCEE26"/>
@@ -17478,7 +18099,7 @@
       </w:pPr>
     </w:lvl>
   </w:abstractNum>
-  <w:abstractNum w:abstractNumId="38" w15:restartNumberingAfterBreak="0">
+  <w:abstractNum w:abstractNumId="39" w15:restartNumberingAfterBreak="0">
     <w:nsid w:val="3EC666F5"/>
     <w:multiLevelType w:val="hybridMultilevel"/>
     <w:tmpl w:val="3FDEAA14"/>
@@ -17591,7 +18212,7 @@
       </w:rPr>
     </w:lvl>
   </w:abstractNum>
-  <w:abstractNum w:abstractNumId="39" w15:restartNumberingAfterBreak="0">
+  <w:abstractNum w:abstractNumId="40" w15:restartNumberingAfterBreak="0">
     <w:nsid w:val="40C04412"/>
     <w:multiLevelType w:val="multilevel"/>
     <w:tmpl w:val="5E9E6CC8"/>
@@ -17704,7 +18325,7 @@
       </w:pPr>
     </w:lvl>
   </w:abstractNum>
-  <w:abstractNum w:abstractNumId="40" w15:restartNumberingAfterBreak="0">
+  <w:abstractNum w:abstractNumId="41" w15:restartNumberingAfterBreak="0">
     <w:nsid w:val="49D23DC1"/>
     <w:multiLevelType w:val="multilevel"/>
     <w:tmpl w:val="BA8ADFBC"/>
@@ -17853,7 +18474,7 @@
       </w:rPr>
     </w:lvl>
   </w:abstractNum>
-  <w:abstractNum w:abstractNumId="41" w15:restartNumberingAfterBreak="0">
+  <w:abstractNum w:abstractNumId="42" w15:restartNumberingAfterBreak="0">
     <w:nsid w:val="4A1B3076"/>
     <w:multiLevelType w:val="multilevel"/>
     <w:tmpl w:val="B6322700"/>
@@ -18002,7 +18623,7 @@
       </w:rPr>
     </w:lvl>
   </w:abstractNum>
-  <w:abstractNum w:abstractNumId="42" w15:restartNumberingAfterBreak="0">
+  <w:abstractNum w:abstractNumId="43" w15:restartNumberingAfterBreak="0">
     <w:nsid w:val="4CC61F6E"/>
     <w:multiLevelType w:val="multilevel"/>
     <w:tmpl w:val="11BEE3F4"/>
@@ -18151,7 +18772,7 @@
       </w:rPr>
     </w:lvl>
   </w:abstractNum>
-  <w:abstractNum w:abstractNumId="43" w15:restartNumberingAfterBreak="0">
+  <w:abstractNum w:abstractNumId="44" w15:restartNumberingAfterBreak="0">
     <w:nsid w:val="4E5315D1"/>
     <w:multiLevelType w:val="hybridMultilevel"/>
     <w:tmpl w:val="80247236"/>
@@ -18240,7 +18861,7 @@
       </w:pPr>
     </w:lvl>
   </w:abstractNum>
-  <w:abstractNum w:abstractNumId="44" w15:restartNumberingAfterBreak="0">
+  <w:abstractNum w:abstractNumId="45" w15:restartNumberingAfterBreak="0">
     <w:nsid w:val="4EB65C27"/>
     <w:multiLevelType w:val="hybridMultilevel"/>
     <w:tmpl w:val="D700BC1A"/>
@@ -18353,7 +18974,7 @@
       </w:rPr>
     </w:lvl>
   </w:abstractNum>
-  <w:abstractNum w:abstractNumId="45" w15:restartNumberingAfterBreak="0">
+  <w:abstractNum w:abstractNumId="46" w15:restartNumberingAfterBreak="0">
     <w:nsid w:val="4ECF0FC5"/>
     <w:multiLevelType w:val="multilevel"/>
     <w:tmpl w:val="642A30A2"/>
@@ -18502,7 +19123,7 @@
       </w:rPr>
     </w:lvl>
   </w:abstractNum>
-  <w:abstractNum w:abstractNumId="46" w15:restartNumberingAfterBreak="0">
+  <w:abstractNum w:abstractNumId="47" w15:restartNumberingAfterBreak="0">
     <w:nsid w:val="4ED5063E"/>
     <w:multiLevelType w:val="hybridMultilevel"/>
     <w:tmpl w:val="5C3275DA"/>
@@ -18615,7 +19236,7 @@
       </w:rPr>
     </w:lvl>
   </w:abstractNum>
-  <w:abstractNum w:abstractNumId="47" w15:restartNumberingAfterBreak="0">
+  <w:abstractNum w:abstractNumId="48" w15:restartNumberingAfterBreak="0">
     <w:nsid w:val="50E6570A"/>
     <w:multiLevelType w:val="multilevel"/>
     <w:tmpl w:val="BAA861FE"/>
@@ -18764,7 +19385,7 @@
       </w:rPr>
     </w:lvl>
   </w:abstractNum>
-  <w:abstractNum w:abstractNumId="48" w15:restartNumberingAfterBreak="0">
+  <w:abstractNum w:abstractNumId="49" w15:restartNumberingAfterBreak="0">
     <w:nsid w:val="53CF6136"/>
     <w:multiLevelType w:val="hybridMultilevel"/>
     <w:tmpl w:val="2BFE22A2"/>
@@ -18877,7 +19498,7 @@
       </w:rPr>
     </w:lvl>
   </w:abstractNum>
-  <w:abstractNum w:abstractNumId="49" w15:restartNumberingAfterBreak="0">
+  <w:abstractNum w:abstractNumId="50" w15:restartNumberingAfterBreak="0">
     <w:nsid w:val="5495127F"/>
     <w:multiLevelType w:val="hybridMultilevel"/>
     <w:tmpl w:val="A1E8CBC2"/>
@@ -18990,7 +19611,7 @@
       </w:rPr>
     </w:lvl>
   </w:abstractNum>
-  <w:abstractNum w:abstractNumId="50" w15:restartNumberingAfterBreak="0">
+  <w:abstractNum w:abstractNumId="51" w15:restartNumberingAfterBreak="0">
     <w:nsid w:val="55FA20CF"/>
     <w:multiLevelType w:val="hybridMultilevel"/>
     <w:tmpl w:val="C3063934"/>
@@ -19103,7 +19724,7 @@
       </w:rPr>
     </w:lvl>
   </w:abstractNum>
-  <w:abstractNum w:abstractNumId="51" w15:restartNumberingAfterBreak="0">
+  <w:abstractNum w:abstractNumId="52" w15:restartNumberingAfterBreak="0">
     <w:nsid w:val="59A01C43"/>
     <w:multiLevelType w:val="multilevel"/>
     <w:tmpl w:val="CACA4708"/>
@@ -19252,7 +19873,7 @@
       </w:rPr>
     </w:lvl>
   </w:abstractNum>
-  <w:abstractNum w:abstractNumId="52" w15:restartNumberingAfterBreak="0">
+  <w:abstractNum w:abstractNumId="53" w15:restartNumberingAfterBreak="0">
     <w:nsid w:val="5D3F0765"/>
     <w:multiLevelType w:val="hybridMultilevel"/>
     <w:tmpl w:val="A1C8EA40"/>
@@ -19338,7 +19959,7 @@
       </w:pPr>
     </w:lvl>
   </w:abstractNum>
-  <w:abstractNum w:abstractNumId="53" w15:restartNumberingAfterBreak="0">
+  <w:abstractNum w:abstractNumId="54" w15:restartNumberingAfterBreak="0">
     <w:nsid w:val="6379722F"/>
     <w:multiLevelType w:val="multilevel"/>
     <w:tmpl w:val="A61CEE30"/>
@@ -19487,7 +20108,7 @@
       </w:rPr>
     </w:lvl>
   </w:abstractNum>
-  <w:abstractNum w:abstractNumId="54" w15:restartNumberingAfterBreak="0">
+  <w:abstractNum w:abstractNumId="55" w15:restartNumberingAfterBreak="0">
     <w:nsid w:val="65955C62"/>
     <w:multiLevelType w:val="multilevel"/>
     <w:tmpl w:val="B852B7FA"/>
@@ -19608,7 +20229,7 @@
       </w:rPr>
     </w:lvl>
   </w:abstractNum>
-  <w:abstractNum w:abstractNumId="55" w15:restartNumberingAfterBreak="0">
+  <w:abstractNum w:abstractNumId="56" w15:restartNumberingAfterBreak="0">
     <w:nsid w:val="66980FED"/>
     <w:multiLevelType w:val="multilevel"/>
     <w:tmpl w:val="69C2C0C0"/>
@@ -19757,7 +20378,7 @@
       </w:rPr>
     </w:lvl>
   </w:abstractNum>
-  <w:abstractNum w:abstractNumId="56" w15:restartNumberingAfterBreak="0">
+  <w:abstractNum w:abstractNumId="57" w15:restartNumberingAfterBreak="0">
     <w:nsid w:val="68CE6FB8"/>
     <w:multiLevelType w:val="multilevel"/>
     <w:tmpl w:val="8C68D918"/>
@@ -19906,7 +20527,7 @@
       </w:rPr>
     </w:lvl>
   </w:abstractNum>
-  <w:abstractNum w:abstractNumId="57" w15:restartNumberingAfterBreak="0">
+  <w:abstractNum w:abstractNumId="58" w15:restartNumberingAfterBreak="0">
     <w:nsid w:val="6B1560BC"/>
     <w:multiLevelType w:val="multilevel"/>
     <w:tmpl w:val="8956137C"/>
@@ -20055,7 +20676,7 @@
       </w:rPr>
     </w:lvl>
   </w:abstractNum>
-  <w:abstractNum w:abstractNumId="58" w15:restartNumberingAfterBreak="0">
+  <w:abstractNum w:abstractNumId="59" w15:restartNumberingAfterBreak="0">
     <w:nsid w:val="6BD34221"/>
     <w:multiLevelType w:val="hybridMultilevel"/>
     <w:tmpl w:val="E9086830"/>
@@ -20168,7 +20789,7 @@
       </w:rPr>
     </w:lvl>
   </w:abstractNum>
-  <w:abstractNum w:abstractNumId="59" w15:restartNumberingAfterBreak="0">
+  <w:abstractNum w:abstractNumId="60" w15:restartNumberingAfterBreak="0">
     <w:nsid w:val="6D065E49"/>
     <w:multiLevelType w:val="hybridMultilevel"/>
     <w:tmpl w:val="D6867088"/>
@@ -20281,7 +20902,7 @@
       </w:rPr>
     </w:lvl>
   </w:abstractNum>
-  <w:abstractNum w:abstractNumId="60" w15:restartNumberingAfterBreak="0">
+  <w:abstractNum w:abstractNumId="61" w15:restartNumberingAfterBreak="0">
     <w:nsid w:val="6DF469C5"/>
     <w:multiLevelType w:val="hybridMultilevel"/>
     <w:tmpl w:val="0AEA1020"/>
@@ -20370,7 +20991,7 @@
       </w:pPr>
     </w:lvl>
   </w:abstractNum>
-  <w:abstractNum w:abstractNumId="61" w15:restartNumberingAfterBreak="0">
+  <w:abstractNum w:abstractNumId="62" w15:restartNumberingAfterBreak="0">
     <w:nsid w:val="6EB55A62"/>
     <w:multiLevelType w:val="multilevel"/>
     <w:tmpl w:val="4754C6B4"/>
@@ -20519,7 +21140,7 @@
       </w:rPr>
     </w:lvl>
   </w:abstractNum>
-  <w:abstractNum w:abstractNumId="62" w15:restartNumberingAfterBreak="0">
+  <w:abstractNum w:abstractNumId="63" w15:restartNumberingAfterBreak="0">
     <w:nsid w:val="71F107AE"/>
     <w:multiLevelType w:val="multilevel"/>
     <w:tmpl w:val="B39A9142"/>
@@ -20668,7 +21289,7 @@
       </w:rPr>
     </w:lvl>
   </w:abstractNum>
-  <w:abstractNum w:abstractNumId="63" w15:restartNumberingAfterBreak="0">
+  <w:abstractNum w:abstractNumId="64" w15:restartNumberingAfterBreak="0">
     <w:nsid w:val="729A45FC"/>
     <w:multiLevelType w:val="hybridMultilevel"/>
     <w:tmpl w:val="2480C68A"/>
@@ -20781,7 +21402,7 @@
       </w:rPr>
     </w:lvl>
   </w:abstractNum>
-  <w:abstractNum w:abstractNumId="64" w15:restartNumberingAfterBreak="0">
+  <w:abstractNum w:abstractNumId="65" w15:restartNumberingAfterBreak="0">
     <w:nsid w:val="749C4E45"/>
     <w:multiLevelType w:val="multilevel"/>
     <w:tmpl w:val="E5B633E8"/>
@@ -20902,7 +21523,7 @@
       </w:rPr>
     </w:lvl>
   </w:abstractNum>
-  <w:abstractNum w:abstractNumId="65" w15:restartNumberingAfterBreak="0">
+  <w:abstractNum w:abstractNumId="66" w15:restartNumberingAfterBreak="0">
     <w:nsid w:val="75B20AE0"/>
     <w:multiLevelType w:val="multilevel"/>
     <w:tmpl w:val="13949564"/>
@@ -21026,7 +21647,7 @@
       </w:pPr>
     </w:lvl>
   </w:abstractNum>
-  <w:abstractNum w:abstractNumId="66" w15:restartNumberingAfterBreak="0">
+  <w:abstractNum w:abstractNumId="67" w15:restartNumberingAfterBreak="0">
     <w:nsid w:val="76172B10"/>
     <w:multiLevelType w:val="hybridMultilevel"/>
     <w:tmpl w:val="7E748EC0"/>
@@ -21139,7 +21760,7 @@
       </w:rPr>
     </w:lvl>
   </w:abstractNum>
-  <w:abstractNum w:abstractNumId="67" w15:restartNumberingAfterBreak="0">
+  <w:abstractNum w:abstractNumId="68" w15:restartNumberingAfterBreak="0">
     <w:nsid w:val="778029CF"/>
     <w:multiLevelType w:val="multilevel"/>
     <w:tmpl w:val="665067DC"/>
@@ -21288,7 +21909,7 @@
       </w:rPr>
     </w:lvl>
   </w:abstractNum>
-  <w:abstractNum w:abstractNumId="68" w15:restartNumberingAfterBreak="0">
+  <w:abstractNum w:abstractNumId="69" w15:restartNumberingAfterBreak="0">
     <w:nsid w:val="784301D9"/>
     <w:multiLevelType w:val="multilevel"/>
     <w:tmpl w:val="3E78F134"/>
@@ -21437,7 +22058,7 @@
       </w:rPr>
     </w:lvl>
   </w:abstractNum>
-  <w:abstractNum w:abstractNumId="69" w15:restartNumberingAfterBreak="0">
+  <w:abstractNum w:abstractNumId="70" w15:restartNumberingAfterBreak="0">
     <w:nsid w:val="789A71B1"/>
     <w:multiLevelType w:val="multilevel"/>
     <w:tmpl w:val="661A67F2"/>
@@ -21553,7 +22174,120 @@
       </w:pPr>
     </w:lvl>
   </w:abstractNum>
-  <w:abstractNum w:abstractNumId="70" w15:restartNumberingAfterBreak="0">
+  <w:abstractNum w:abstractNumId="71" w15:restartNumberingAfterBreak="0">
+    <w:nsid w:val="797B2F3D"/>
+    <w:multiLevelType w:val="hybridMultilevel"/>
+    <w:tmpl w:val="CD666230"/>
+    <w:lvl w:ilvl="0" w:tplc="04090001">
+      <w:start w:val="1"/>
+      <w:numFmt w:val="bullet"/>
+      <w:lvlText w:val=""/>
+      <w:lvlJc w:val="left"/>
+      <w:pPr>
+        <w:ind w:left="1080" w:hanging="360"/>
+      </w:pPr>
+      <w:rPr>
+        <w:rFonts w:ascii="Symbol" w:hAnsi="Symbol" w:hint="default"/>
+      </w:rPr>
+    </w:lvl>
+    <w:lvl w:ilvl="1" w:tplc="04090003" w:tentative="1">
+      <w:start w:val="1"/>
+      <w:numFmt w:val="bullet"/>
+      <w:lvlText w:val="o"/>
+      <w:lvlJc w:val="left"/>
+      <w:pPr>
+        <w:ind w:left="1800" w:hanging="360"/>
+      </w:pPr>
+      <w:rPr>
+        <w:rFonts w:ascii="Courier New" w:hAnsi="Courier New" w:cs="Courier New" w:hint="default"/>
+      </w:rPr>
+    </w:lvl>
+    <w:lvl w:ilvl="2" w:tplc="04090005" w:tentative="1">
+      <w:start w:val="1"/>
+      <w:numFmt w:val="bullet"/>
+      <w:lvlText w:val=""/>
+      <w:lvlJc w:val="left"/>
+      <w:pPr>
+        <w:ind w:left="2520" w:hanging="360"/>
+      </w:pPr>
+      <w:rPr>
+        <w:rFonts w:ascii="Wingdings" w:hAnsi="Wingdings" w:hint="default"/>
+      </w:rPr>
+    </w:lvl>
+    <w:lvl w:ilvl="3" w:tplc="04090001" w:tentative="1">
+      <w:start w:val="1"/>
+      <w:numFmt w:val="bullet"/>
+      <w:lvlText w:val=""/>
+      <w:lvlJc w:val="left"/>
+      <w:pPr>
+        <w:ind w:left="3240" w:hanging="360"/>
+      </w:pPr>
+      <w:rPr>
+        <w:rFonts w:ascii="Symbol" w:hAnsi="Symbol" w:hint="default"/>
+      </w:rPr>
+    </w:lvl>
+    <w:lvl w:ilvl="4" w:tplc="04090003" w:tentative="1">
+      <w:start w:val="1"/>
+      <w:numFmt w:val="bullet"/>
+      <w:lvlText w:val="o"/>
+      <w:lvlJc w:val="left"/>
+      <w:pPr>
+        <w:ind w:left="3960" w:hanging="360"/>
+      </w:pPr>
+      <w:rPr>
+        <w:rFonts w:ascii="Courier New" w:hAnsi="Courier New" w:cs="Courier New" w:hint="default"/>
+      </w:rPr>
+    </w:lvl>
+    <w:lvl w:ilvl="5" w:tplc="04090005" w:tentative="1">
+      <w:start w:val="1"/>
+      <w:numFmt w:val="bullet"/>
+      <w:lvlText w:val=""/>
+      <w:lvlJc w:val="left"/>
+      <w:pPr>
+        <w:ind w:left="4680" w:hanging="360"/>
+      </w:pPr>
+      <w:rPr>
+        <w:rFonts w:ascii="Wingdings" w:hAnsi="Wingdings" w:hint="default"/>
+      </w:rPr>
+    </w:lvl>
+    <w:lvl w:ilvl="6" w:tplc="04090001" w:tentative="1">
+      <w:start w:val="1"/>
+      <w:numFmt w:val="bullet"/>
+      <w:lvlText w:val=""/>
+      <w:lvlJc w:val="left"/>
+      <w:pPr>
+        <w:ind w:left="5400" w:hanging="360"/>
+      </w:pPr>
+      <w:rPr>
+        <w:rFonts w:ascii="Symbol" w:hAnsi="Symbol" w:hint="default"/>
+      </w:rPr>
+    </w:lvl>
+    <w:lvl w:ilvl="7" w:tplc="04090003" w:tentative="1">
+      <w:start w:val="1"/>
+      <w:numFmt w:val="bullet"/>
+      <w:lvlText w:val="o"/>
+      <w:lvlJc w:val="left"/>
+      <w:pPr>
+        <w:ind w:left="6120" w:hanging="360"/>
+      </w:pPr>
+      <w:rPr>
+        <w:rFonts w:ascii="Courier New" w:hAnsi="Courier New" w:cs="Courier New" w:hint="default"/>
+      </w:rPr>
+    </w:lvl>
+    <w:lvl w:ilvl="8" w:tplc="04090005" w:tentative="1">
+      <w:start w:val="1"/>
+      <w:numFmt w:val="bullet"/>
+      <w:lvlText w:val=""/>
+      <w:lvlJc w:val="left"/>
+      <w:pPr>
+        <w:ind w:left="6840" w:hanging="360"/>
+      </w:pPr>
+      <w:rPr>
+        <w:rFonts w:ascii="Wingdings" w:hAnsi="Wingdings" w:hint="default"/>
+      </w:rPr>
+    </w:lvl>
+  </w:abstractNum>
+  <w:abstractNum w:abstractNumId="72" w15:restartNumberingAfterBreak="0">
     <w:nsid w:val="7C0513DF"/>
     <w:multiLevelType w:val="multilevel"/>
     <w:tmpl w:val="10446322"/>
@@ -21702,7 +22436,7 @@
       </w:rPr>
     </w:lvl>
   </w:abstractNum>
-  <w:abstractNum w:abstractNumId="71" w15:restartNumberingAfterBreak="0">
+  <w:abstractNum w:abstractNumId="73" w15:restartNumberingAfterBreak="0">
     <w:nsid w:val="7C6B57EA"/>
     <w:multiLevelType w:val="multilevel"/>
     <w:tmpl w:val="CC127FB2"/>
@@ -21851,7 +22585,7 @@
       </w:rPr>
     </w:lvl>
   </w:abstractNum>
-  <w:abstractNum w:abstractNumId="72" w15:restartNumberingAfterBreak="0">
+  <w:abstractNum w:abstractNumId="74" w15:restartNumberingAfterBreak="0">
     <w:nsid w:val="7EF95F71"/>
     <w:multiLevelType w:val="multilevel"/>
     <w:tmpl w:val="920E8DF8"/>
@@ -22001,67 +22735,67 @@
     </w:lvl>
   </w:abstractNum>
   <w:num w:numId="1" w16cid:durableId="1503860434">
-    <w:abstractNumId w:val="64"/>
+    <w:abstractNumId w:val="65"/>
   </w:num>
   <w:num w:numId="2" w16cid:durableId="591008065">
-    <w:abstractNumId w:val="54"/>
+    <w:abstractNumId w:val="55"/>
   </w:num>
   <w:num w:numId="3" w16cid:durableId="1963148970">
     <w:abstractNumId w:val="10"/>
   </w:num>
   <w:num w:numId="4" w16cid:durableId="1109079899">
-    <w:abstractNumId w:val="35"/>
+    <w:abstractNumId w:val="36"/>
   </w:num>
   <w:num w:numId="5" w16cid:durableId="1969583472">
-    <w:abstractNumId w:val="69"/>
+    <w:abstractNumId w:val="70"/>
   </w:num>
   <w:num w:numId="6" w16cid:durableId="1181436825">
+    <w:abstractNumId w:val="33"/>
+  </w:num>
+  <w:num w:numId="7" w16cid:durableId="1805730547">
+    <w:abstractNumId w:val="26"/>
+  </w:num>
+  <w:num w:numId="8" w16cid:durableId="777650489">
+    <w:abstractNumId w:val="50"/>
+  </w:num>
+  <w:num w:numId="9" w16cid:durableId="226109802">
+    <w:abstractNumId w:val="66"/>
+  </w:num>
+  <w:num w:numId="10" w16cid:durableId="1265652310">
     <w:abstractNumId w:val="32"/>
   </w:num>
-  <w:num w:numId="7" w16cid:durableId="1805730547">
-    <w:abstractNumId w:val="25"/>
-  </w:num>
-  <w:num w:numId="8" w16cid:durableId="777650489">
-    <w:abstractNumId w:val="49"/>
-  </w:num>
-  <w:num w:numId="9" w16cid:durableId="226109802">
-    <w:abstractNumId w:val="65"/>
-  </w:num>
-  <w:num w:numId="10" w16cid:durableId="1265652310">
-    <w:abstractNumId w:val="31"/>
-  </w:num>
   <w:num w:numId="11" w16cid:durableId="1349405528">
-    <w:abstractNumId w:val="39"/>
+    <w:abstractNumId w:val="40"/>
   </w:num>
   <w:num w:numId="12" w16cid:durableId="2106459849">
     <w:abstractNumId w:val="0"/>
   </w:num>
   <w:num w:numId="13" w16cid:durableId="1095127544">
-    <w:abstractNumId w:val="42"/>
+    <w:abstractNumId w:val="43"/>
   </w:num>
   <w:num w:numId="14" w16cid:durableId="2045252265">
-    <w:abstractNumId w:val="72"/>
+    <w:abstractNumId w:val="74"/>
   </w:num>
   <w:num w:numId="15" w16cid:durableId="1497451779">
     <w:abstractNumId w:val="17"/>
   </w:num>
   <w:num w:numId="16" w16cid:durableId="1474441049">
-    <w:abstractNumId w:val="34"/>
+    <w:abstractNumId w:val="35"/>
   </w:num>
   <w:num w:numId="17" w16cid:durableId="2076774221">
     <w:abstractNumId w:val="13"/>
   </w:num>
   <w:num w:numId="18" w16cid:durableId="720404327">
-    <w:abstractNumId w:val="28"/>
+    <w:abstractNumId w:val="29"/>
   </w:num>
   <w:num w:numId="19" w16cid:durableId="2047219424">
-    <w:abstractNumId w:val="56"/>
+    <w:abstractNumId w:val="57"/>
   </w:num>
   <w:num w:numId="20" w16cid:durableId="176236128">
-    <w:abstractNumId w:val="45"/>
+    <w:abstractNumId w:val="46"/>
   </w:num>
   <w:num w:numId="21" w16cid:durableId="660888822">
-    <w:abstractNumId w:val="71"/>
+    <w:abstractNumId w:val="73"/>
   </w:num>
   <w:num w:numId="22" w16cid:durableId="463156530">
     <w:abstractNumId w:val="14"/>
@@ -22070,7 +22804,7 @@
     <w:abstractNumId w:val="7"/>
   </w:num>
   <w:num w:numId="24" w16cid:durableId="1941643786">
-    <w:abstractNumId w:val="68"/>
+    <w:abstractNumId w:val="69"/>
   </w:num>
   <w:num w:numId="25" w16cid:durableId="1608393246">
     <w:abstractNumId w:val="3"/>
@@ -22079,16 +22813,16 @@
     <w:abstractNumId w:val="5"/>
   </w:num>
   <w:num w:numId="27" w16cid:durableId="1926331854">
-    <w:abstractNumId w:val="40"/>
+    <w:abstractNumId w:val="41"/>
   </w:num>
   <w:num w:numId="28" w16cid:durableId="340746734">
-    <w:abstractNumId w:val="18"/>
+    <w:abstractNumId w:val="19"/>
   </w:num>
   <w:num w:numId="29" w16cid:durableId="1368211936">
-    <w:abstractNumId w:val="33"/>
+    <w:abstractNumId w:val="34"/>
   </w:num>
   <w:num w:numId="30" w16cid:durableId="1827697071">
-    <w:abstractNumId w:val="67"/>
+    <w:abstractNumId w:val="68"/>
   </w:num>
   <w:num w:numId="31" w16cid:durableId="1405831256">
     <w:abstractNumId w:val="11"/>
@@ -22097,127 +22831,133 @@
     <w:abstractNumId w:val="4"/>
   </w:num>
   <w:num w:numId="33" w16cid:durableId="132480584">
-    <w:abstractNumId w:val="29"/>
+    <w:abstractNumId w:val="30"/>
   </w:num>
   <w:num w:numId="34" w16cid:durableId="408889523">
-    <w:abstractNumId w:val="62"/>
+    <w:abstractNumId w:val="63"/>
   </w:num>
   <w:num w:numId="35" w16cid:durableId="1687245839">
     <w:abstractNumId w:val="8"/>
   </w:num>
   <w:num w:numId="36" w16cid:durableId="1026058083">
-    <w:abstractNumId w:val="51"/>
+    <w:abstractNumId w:val="52"/>
   </w:num>
   <w:num w:numId="37" w16cid:durableId="575358946">
-    <w:abstractNumId w:val="63"/>
+    <w:abstractNumId w:val="64"/>
   </w:num>
   <w:num w:numId="38" w16cid:durableId="1717393634">
-    <w:abstractNumId w:val="57"/>
+    <w:abstractNumId w:val="58"/>
   </w:num>
   <w:num w:numId="39" w16cid:durableId="1768765534">
     <w:abstractNumId w:val="16"/>
   </w:num>
   <w:num w:numId="40" w16cid:durableId="289628794">
-    <w:abstractNumId w:val="26"/>
+    <w:abstractNumId w:val="27"/>
   </w:num>
   <w:num w:numId="41" w16cid:durableId="99221906">
-    <w:abstractNumId w:val="55"/>
+    <w:abstractNumId w:val="56"/>
   </w:num>
   <w:num w:numId="42" w16cid:durableId="612831305">
-    <w:abstractNumId w:val="53"/>
+    <w:abstractNumId w:val="54"/>
   </w:num>
   <w:num w:numId="43" w16cid:durableId="162938622">
-    <w:abstractNumId w:val="27"/>
+    <w:abstractNumId w:val="28"/>
   </w:num>
   <w:num w:numId="44" w16cid:durableId="1608779428">
-    <w:abstractNumId w:val="47"/>
+    <w:abstractNumId w:val="48"/>
   </w:num>
   <w:num w:numId="45" w16cid:durableId="1295284397">
-    <w:abstractNumId w:val="50"/>
+    <w:abstractNumId w:val="51"/>
   </w:num>
   <w:num w:numId="46" w16cid:durableId="1099368979">
     <w:abstractNumId w:val="2"/>
   </w:num>
   <w:num w:numId="47" w16cid:durableId="776367522">
-    <w:abstractNumId w:val="37"/>
+    <w:abstractNumId w:val="38"/>
   </w:num>
   <w:num w:numId="48" w16cid:durableId="120152670">
     <w:abstractNumId w:val="1"/>
   </w:num>
   <w:num w:numId="49" w16cid:durableId="1102453527">
-    <w:abstractNumId w:val="60"/>
+    <w:abstractNumId w:val="61"/>
   </w:num>
   <w:num w:numId="50" w16cid:durableId="233593040">
-    <w:abstractNumId w:val="52"/>
+    <w:abstractNumId w:val="53"/>
   </w:num>
   <w:num w:numId="51" w16cid:durableId="2007399810">
-    <w:abstractNumId w:val="43"/>
+    <w:abstractNumId w:val="44"/>
   </w:num>
   <w:num w:numId="52" w16cid:durableId="1854344335">
-    <w:abstractNumId w:val="58"/>
+    <w:abstractNumId w:val="59"/>
   </w:num>
   <w:num w:numId="53" w16cid:durableId="668875536">
     <w:abstractNumId w:val="15"/>
   </w:num>
   <w:num w:numId="54" w16cid:durableId="946156591">
-    <w:abstractNumId w:val="36"/>
+    <w:abstractNumId w:val="37"/>
   </w:num>
   <w:num w:numId="55" w16cid:durableId="389350067">
-    <w:abstractNumId w:val="23"/>
+    <w:abstractNumId w:val="24"/>
   </w:num>
   <w:num w:numId="56" w16cid:durableId="767509393">
-    <w:abstractNumId w:val="46"/>
+    <w:abstractNumId w:val="47"/>
   </w:num>
   <w:num w:numId="57" w16cid:durableId="754713347">
-    <w:abstractNumId w:val="61"/>
+    <w:abstractNumId w:val="62"/>
   </w:num>
   <w:num w:numId="58" w16cid:durableId="1680893106">
-    <w:abstractNumId w:val="44"/>
+    <w:abstractNumId w:val="45"/>
   </w:num>
   <w:num w:numId="59" w16cid:durableId="1205631871">
-    <w:abstractNumId w:val="70"/>
+    <w:abstractNumId w:val="72"/>
   </w:num>
   <w:num w:numId="60" w16cid:durableId="1413967371">
-    <w:abstractNumId w:val="19"/>
+    <w:abstractNumId w:val="20"/>
   </w:num>
   <w:num w:numId="61" w16cid:durableId="1968730642">
-    <w:abstractNumId w:val="30"/>
+    <w:abstractNumId w:val="31"/>
   </w:num>
   <w:num w:numId="62" w16cid:durableId="844051479">
     <w:abstractNumId w:val="9"/>
   </w:num>
   <w:num w:numId="63" w16cid:durableId="1288850841">
-    <w:abstractNumId w:val="38"/>
+    <w:abstractNumId w:val="39"/>
   </w:num>
   <w:num w:numId="64" w16cid:durableId="276716746">
-    <w:abstractNumId w:val="21"/>
+    <w:abstractNumId w:val="22"/>
   </w:num>
   <w:num w:numId="65" w16cid:durableId="1287079753">
-    <w:abstractNumId w:val="66"/>
+    <w:abstractNumId w:val="67"/>
   </w:num>
   <w:num w:numId="66" w16cid:durableId="53822233">
-    <w:abstractNumId w:val="48"/>
+    <w:abstractNumId w:val="49"/>
   </w:num>
   <w:num w:numId="67" w16cid:durableId="393360494">
     <w:abstractNumId w:val="6"/>
   </w:num>
   <w:num w:numId="68" w16cid:durableId="1778020347">
-    <w:abstractNumId w:val="24"/>
+    <w:abstractNumId w:val="25"/>
   </w:num>
   <w:num w:numId="69" w16cid:durableId="1797335885">
-    <w:abstractNumId w:val="59"/>
+    <w:abstractNumId w:val="60"/>
   </w:num>
   <w:num w:numId="70" w16cid:durableId="538006667">
-    <w:abstractNumId w:val="22"/>
+    <w:abstractNumId w:val="23"/>
   </w:num>
   <w:num w:numId="71" w16cid:durableId="2078893500">
-    <w:abstractNumId w:val="20"/>
+    <w:abstractNumId w:val="21"/>
   </w:num>
   <w:num w:numId="72" w16cid:durableId="1041395649">
-    <w:abstractNumId w:val="41"/>
+    <w:abstractNumId w:val="42"/>
   </w:num>
   <w:num w:numId="73" w16cid:durableId="1581478637">
     <w:abstractNumId w:val="12"/>
+  </w:num>
+  <w:num w:numId="74" w16cid:durableId="2033260225">
+    <w:abstractNumId w:val="18"/>
+  </w:num>
+  <w:num w:numId="75" w16cid:durableId="1251424269">
+    <w:abstractNumId w:val="71"/>
   </w:num>
 </w:numbering>
 </file>
@@ -22722,6 +23462,7 @@
   <w:style w:type="character" w:default="1" w:styleId="DefaultParagraphFont">
     <w:name w:val="Default Paragraph Font"/>
     <w:uiPriority w:val="1"/>
+    <w:semiHidden/>
     <w:unhideWhenUsed/>
   </w:style>
   <w:style w:type="table" w:default="1" w:styleId="TableNormal">

</xml_diff>